<commit_message>
Rename notebooks and update project files
Remove spaces from notebook filenames, add VS Code Conda settings and ignore rules for DOCX files, update notebook outputs, and remove the PDF.
</commit_message>
<xml_diff>
--- a/Ising footprint computation.docx
+++ b/Ising footprint computation.docx
@@ -1,6 +1,6 @@
 
 <file path=word/document.xml><?xml version="1.0" encoding="utf-8"?>
-<w:document xmlns:wpc="http://schemas.microsoft.com/office/word/2010/wordprocessingCanvas" xmlns:cx="http://schemas.microsoft.com/office/drawing/2014/chartex" xmlns:cx1="http://schemas.microsoft.com/office/drawing/2015/9/8/chartex" xmlns:cx2="http://schemas.microsoft.com/office/drawing/2015/10/21/chartex" xmlns:cx3="http://schemas.microsoft.com/office/drawing/2016/5/9/chartex" xmlns:cx4="http://schemas.microsoft.com/office/drawing/2016/5/10/chartex" xmlns:cx5="http://schemas.microsoft.com/office/drawing/2016/5/11/chartex" xmlns:cx6="http://schemas.microsoft.com/office/drawing/2016/5/12/chartex" xmlns:cx7="http://schemas.microsoft.com/office/drawing/2016/5/13/chartex" xmlns:cx8="http://schemas.microsoft.com/office/drawing/2016/5/14/chartex" xmlns:mc="http://schemas.openxmlformats.org/markup-compatibility/2006" xmlns:aink="http://schemas.microsoft.com/office/drawing/2016/ink" xmlns:am3d="http://schemas.microsoft.com/office/drawing/2017/model3d" xmlns:o="urn:schemas-microsoft-com:office:office" xmlns:oel="http://schemas.microsoft.com/office/2019/extlst" xmlns:r="http://schemas.openxmlformats.org/officeDocument/2006/relationships" xmlns:m="http://schemas.openxmlformats.org/officeDocument/2006/math" xmlns:v="urn:schemas-microsoft-com:vml" xmlns:wp14="http://schemas.microsoft.com/office/word/2010/wordprocessingDrawing" xmlns:wp="http://schemas.openxmlformats.org/drawingml/2006/wordprocessingDrawing" xmlns:w10="urn:schemas-microsoft-com:office:word" xmlns:w="http://schemas.openxmlformats.org/wordprocessingml/2006/main" xmlns:w14="http://schemas.microsoft.com/office/word/2010/wordml" xmlns:w15="http://schemas.microsoft.com/office/word/2012/wordml" xmlns:w16cei="http://schemas.microsoft.com/office/word/2026/wordml/cei" xmlns:w16cex="http://schemas.microsoft.com/office/word/2018/wordml/cex" xmlns:w16cid="http://schemas.microsoft.com/office/word/2016/wordml/cid" xmlns:w16="http://schemas.microsoft.com/office/word/2018/wordml" xmlns:w16du="http://schemas.microsoft.com/office/word/2023/wordml/word16du" xmlns:w16sdtdh="http://schemas.microsoft.com/office/word/2020/wordml/sdtdatahash" xmlns:w16sdtfl="http://schemas.microsoft.com/office/word/2024/wordml/sdtformatlock" xmlns:w16se="http://schemas.microsoft.com/office/word/2015/wordml/symex" xmlns:wpg="http://schemas.microsoft.com/office/word/2010/wordprocessingGroup" xmlns:wpi="http://schemas.microsoft.com/office/word/2010/wordprocessingInk" xmlns:wne="http://schemas.microsoft.com/office/word/2006/wordml" xmlns:wps="http://schemas.microsoft.com/office/word/2010/wordprocessingShape" mc:Ignorable="w14 w15 w16se w16cid w16 w16cex w16sdtdh w16sdtfl w16du wp14">
+<w:document xmlns:wpc="http://schemas.microsoft.com/office/word/2010/wordprocessingCanvas" xmlns:cx="http://schemas.microsoft.com/office/drawing/2014/chartex" xmlns:cx1="http://schemas.microsoft.com/office/drawing/2015/9/8/chartex" xmlns:cx2="http://schemas.microsoft.com/office/drawing/2015/10/21/chartex" xmlns:cx3="http://schemas.microsoft.com/office/drawing/2016/5/9/chartex" xmlns:cx4="http://schemas.microsoft.com/office/drawing/2016/5/10/chartex" xmlns:cx5="http://schemas.microsoft.com/office/drawing/2016/5/11/chartex" xmlns:cx6="http://schemas.microsoft.com/office/drawing/2016/5/12/chartex" xmlns:cx7="http://schemas.microsoft.com/office/drawing/2016/5/13/chartex" xmlns:cx8="http://schemas.microsoft.com/office/drawing/2016/5/14/chartex" xmlns:mc="http://schemas.openxmlformats.org/markup-compatibility/2006" xmlns:aink="http://schemas.microsoft.com/office/drawing/2016/ink" xmlns:am3d="http://schemas.microsoft.com/office/drawing/2017/model3d" xmlns:o="urn:schemas-microsoft-com:office:office" xmlns:oel="http://schemas.microsoft.com/office/2019/extlst" xmlns:r="http://schemas.openxmlformats.org/officeDocument/2006/relationships" xmlns:m="http://schemas.openxmlformats.org/officeDocument/2006/math" xmlns:v="urn:schemas-microsoft-com:vml" xmlns:wp14="http://schemas.microsoft.com/office/word/2010/wordprocessingDrawing" xmlns:wp="http://schemas.openxmlformats.org/drawingml/2006/wordprocessingDrawing" xmlns:w10="urn:schemas-microsoft-com:office:word" xmlns:w="http://schemas.openxmlformats.org/wordprocessingml/2006/main" xmlns:w14="http://schemas.microsoft.com/office/word/2010/wordml" xmlns:w15="http://schemas.microsoft.com/office/word/2012/wordml" xmlns:w16cex="http://schemas.microsoft.com/office/word/2018/wordml/cex" xmlns:w16cid="http://schemas.microsoft.com/office/word/2016/wordml/cid" xmlns:w16="http://schemas.microsoft.com/office/word/2018/wordml" xmlns:w16du="http://schemas.microsoft.com/office/word/2023/wordml/word16du" xmlns:w16sdtdh="http://schemas.microsoft.com/office/word/2020/wordml/sdtdatahash" xmlns:w16sdtfl="http://schemas.microsoft.com/office/word/2024/wordml/sdtformatlock" xmlns:w16se="http://schemas.microsoft.com/office/word/2015/wordml/symex" xmlns:wpg="http://schemas.microsoft.com/office/word/2010/wordprocessingGroup" xmlns:wpi="http://schemas.microsoft.com/office/word/2010/wordprocessingInk" xmlns:wne="http://schemas.microsoft.com/office/word/2006/wordml" xmlns:wps="http://schemas.microsoft.com/office/word/2010/wordprocessingShape" mc:Ignorable="w14 w15 w16se w16cid w16 w16cex w16sdtdh w16sdtfl w16du wp14">
   <w:body>
     <w:p>
       <w:pPr>
@@ -665,7 +665,10 @@
             </m:dPr>
             <m:e>
               <m:r>
-                <m:t>0ψ</m:t>
+                <m:t>0</m:t>
+              </m:r>
+              <m:r>
+                <m:t>ψ</m:t>
               </m:r>
             </m:e>
           </m:d>
@@ -731,7 +734,10 @@
                 </m:e>
               </m:d>
               <m:r>
-                <m:t>+b</m:t>
+                <m:t>+</m:t>
+              </m:r>
+              <m:r>
+                <m:t>b</m:t>
               </m:r>
               <m:d>
                 <m:dPr>
@@ -909,7 +915,10 @@
                 </m:e>
               </m:d>
               <m:r>
-                <m:t>+b</m:t>
+                <m:t>+</m:t>
+              </m:r>
+              <m:r>
+                <m:t>b</m:t>
               </m:r>
               <m:d>
                 <m:dPr>
@@ -991,7 +1000,10 @@
                 </m:e>
               </m:d>
               <m:r>
-                <m:t>+b</m:t>
+                <m:t>+</m:t>
+              </m:r>
+              <m:r>
+                <m:t>b</m:t>
               </m:r>
               <m:d>
                 <m:dPr>
@@ -1023,7 +1035,10 @@
             <m:rPr>
               <m:aln/>
             </m:rPr>
-            <m:t>=a</m:t>
+            <m:t>=</m:t>
+          </m:r>
+          <m:r>
+            <m:t>a</m:t>
           </m:r>
           <m:d>
             <m:dPr>
@@ -1042,7 +1057,10 @@
             </m:e>
           </m:d>
           <m:r>
-            <m:t>+b</m:t>
+            <m:t>+</m:t>
+          </m:r>
+          <m:r>
+            <m:t>b</m:t>
           </m:r>
           <m:d>
             <m:dPr>
@@ -1157,7 +1175,13 @@
                 <w:rPr>
                   <w:rFonts w:eastAsiaTheme="minorEastAsia"/>
                 </w:rPr>
-                <m:t>+a</m:t>
+                <m:t>+</m:t>
+              </m:r>
+              <m:r>
+                <w:rPr>
+                  <w:rFonts w:eastAsiaTheme="minorEastAsia"/>
+                </w:rPr>
+                <m:t>a</m:t>
               </m:r>
               <m:d>
                 <m:dPr>
@@ -1183,7 +1207,13 @@
                 <w:rPr>
                   <w:rFonts w:eastAsiaTheme="minorEastAsia"/>
                 </w:rPr>
-                <m:t>+b</m:t>
+                <m:t>+</m:t>
+              </m:r>
+              <m:r>
+                <w:rPr>
+                  <w:rFonts w:eastAsiaTheme="minorEastAsia"/>
+                </w:rPr>
+                <m:t>b</m:t>
               </m:r>
               <m:d>
                 <m:dPr>
@@ -1209,7 +1239,13 @@
                 <w:rPr>
                   <w:rFonts w:eastAsiaTheme="minorEastAsia"/>
                 </w:rPr>
-                <m:t>+b</m:t>
+                <m:t>+</m:t>
+              </m:r>
+              <m:r>
+                <w:rPr>
+                  <w:rFonts w:eastAsiaTheme="minorEastAsia"/>
+                </w:rPr>
+                <m:t>b</m:t>
               </m:r>
               <m:d>
                 <m:dPr>
@@ -1446,7 +1482,13 @@
                 <w:rPr>
                   <w:rFonts w:eastAsiaTheme="minorEastAsia"/>
                 </w:rPr>
-                <m:t>+a</m:t>
+                <m:t>+</m:t>
+              </m:r>
+              <m:r>
+                <w:rPr>
+                  <w:rFonts w:eastAsiaTheme="minorEastAsia"/>
+                </w:rPr>
+                <m:t>a</m:t>
               </m:r>
               <m:d>
                 <m:dPr>
@@ -1530,7 +1572,13 @@
                 <w:rPr>
                   <w:rFonts w:eastAsiaTheme="minorEastAsia"/>
                 </w:rPr>
-                <m:t>+b</m:t>
+                <m:t>+</m:t>
+              </m:r>
+              <m:r>
+                <w:rPr>
+                  <w:rFonts w:eastAsiaTheme="minorEastAsia"/>
+                </w:rPr>
+                <m:t>b</m:t>
               </m:r>
               <m:d>
                 <m:dPr>
@@ -1556,7 +1604,13 @@
                 <w:rPr>
                   <w:rFonts w:eastAsiaTheme="minorEastAsia"/>
                 </w:rPr>
-                <m:t>+b</m:t>
+                <m:t>+</m:t>
+              </m:r>
+              <m:r>
+                <w:rPr>
+                  <w:rFonts w:eastAsiaTheme="minorEastAsia"/>
+                </w:rPr>
+                <m:t>b</m:t>
               </m:r>
               <m:d>
                 <m:dPr>
@@ -1738,7 +1792,13 @@
                 <w:rPr>
                   <w:rFonts w:eastAsiaTheme="minorEastAsia"/>
                 </w:rPr>
-                <m:t>+a</m:t>
+                <m:t>+</m:t>
+              </m:r>
+              <m:r>
+                <w:rPr>
+                  <w:rFonts w:eastAsiaTheme="minorEastAsia"/>
+                </w:rPr>
+                <m:t>a</m:t>
               </m:r>
               <m:d>
                 <m:dPr>
@@ -1764,7 +1824,13 @@
                 <w:rPr>
                   <w:rFonts w:eastAsiaTheme="minorEastAsia"/>
                 </w:rPr>
-                <m:t>+b</m:t>
+                <m:t>+</m:t>
+              </m:r>
+              <m:r>
+                <w:rPr>
+                  <w:rFonts w:eastAsiaTheme="minorEastAsia"/>
+                </w:rPr>
+                <m:t>b</m:t>
               </m:r>
               <m:d>
                 <m:dPr>
@@ -1790,7 +1856,13 @@
                 <w:rPr>
                   <w:rFonts w:eastAsiaTheme="minorEastAsia"/>
                 </w:rPr>
-                <m:t>-b</m:t>
+                <m:t>-</m:t>
+              </m:r>
+              <m:r>
+                <w:rPr>
+                  <w:rFonts w:eastAsiaTheme="minorEastAsia"/>
+                </w:rPr>
+                <m:t>b</m:t>
               </m:r>
               <m:d>
                 <m:dPr>
@@ -1832,7 +1904,13 @@
             <w:rPr>
               <w:rFonts w:eastAsiaTheme="minorEastAsia"/>
             </w:rPr>
-            <m:t>=a</m:t>
+            <m:t>=</m:t>
+          </m:r>
+          <m:r>
+            <w:rPr>
+              <w:rFonts w:eastAsiaTheme="minorEastAsia"/>
+            </w:rPr>
+            <m:t>a</m:t>
           </m:r>
           <m:d>
             <m:dPr>
@@ -1858,7 +1936,13 @@
             <w:rPr>
               <w:rFonts w:eastAsiaTheme="minorEastAsia"/>
             </w:rPr>
-            <m:t>+b</m:t>
+            <m:t>+</m:t>
+          </m:r>
+          <m:r>
+            <w:rPr>
+              <w:rFonts w:eastAsiaTheme="minorEastAsia"/>
+            </w:rPr>
+            <m:t>b</m:t>
           </m:r>
           <m:d>
             <m:dPr>
@@ -1876,7 +1960,13 @@
                 <w:rPr>
                   <w:rFonts w:eastAsiaTheme="minorEastAsia"/>
                 </w:rPr>
-                <m:t>-1</m:t>
+                <m:t>-</m:t>
+              </m:r>
+              <m:r>
+                <w:rPr>
+                  <w:rFonts w:eastAsiaTheme="minorEastAsia"/>
+                </w:rPr>
+                <m:t>1</m:t>
               </m:r>
             </m:e>
           </m:d>
@@ -1902,7 +1992,13 @@
           <w:rPr>
             <w:rFonts w:eastAsiaTheme="minorEastAsia"/>
           </w:rPr>
-          <m:t>t=3</m:t>
+          <m:t>t</m:t>
+        </m:r>
+        <m:r>
+          <w:rPr>
+            <w:rFonts w:eastAsiaTheme="minorEastAsia"/>
+          </w:rPr>
+          <m:t>=3</m:t>
         </m:r>
       </m:oMath>
       <w:r>
@@ -1981,7 +2077,13 @@
             <w:rPr>
               <w:rFonts w:eastAsiaTheme="minorEastAsia"/>
             </w:rPr>
-            <m:t>=a</m:t>
+            <m:t>=</m:t>
+          </m:r>
+          <m:r>
+            <w:rPr>
+              <w:rFonts w:eastAsiaTheme="minorEastAsia"/>
+            </w:rPr>
+            <m:t>a</m:t>
           </m:r>
           <m:d>
             <m:dPr>
@@ -2045,7 +2147,13 @@
             <w:rPr>
               <w:rFonts w:eastAsiaTheme="minorEastAsia"/>
             </w:rPr>
-            <m:t>+b</m:t>
+            <m:t>+</m:t>
+          </m:r>
+          <m:r>
+            <w:rPr>
+              <w:rFonts w:eastAsiaTheme="minorEastAsia"/>
+            </w:rPr>
+            <m:t>b</m:t>
           </m:r>
           <m:d>
             <m:dPr>
@@ -2123,7 +2231,13 @@
             <w:rPr>
               <w:rFonts w:eastAsiaTheme="minorEastAsia"/>
             </w:rPr>
-            <m:t>=a</m:t>
+            <m:t>=</m:t>
+          </m:r>
+          <m:r>
+            <w:rPr>
+              <w:rFonts w:eastAsiaTheme="minorEastAsia"/>
+            </w:rPr>
+            <m:t>a</m:t>
           </m:r>
           <m:d>
             <m:dPr>
@@ -2149,7 +2263,13 @@
             <w:rPr>
               <w:rFonts w:eastAsiaTheme="minorEastAsia"/>
             </w:rPr>
-            <m:t>+b</m:t>
+            <m:t>+</m:t>
+          </m:r>
+          <m:r>
+            <w:rPr>
+              <w:rFonts w:eastAsiaTheme="minorEastAsia"/>
+            </w:rPr>
+            <m:t>b</m:t>
           </m:r>
           <m:d>
             <m:dPr>
@@ -2592,7 +2712,10 @@
             </m:e>
           </m:d>
           <m:r>
-            <m:t>=a</m:t>
+            <m:t>=</m:t>
+          </m:r>
+          <m:r>
+            <m:t>a</m:t>
           </m:r>
           <m:d>
             <m:dPr>
@@ -2611,7 +2734,10 @@
             </m:e>
           </m:d>
           <m:r>
-            <m:t>+b</m:t>
+            <m:t>+</m:t>
+          </m:r>
+          <m:r>
+            <m:t>b</m:t>
           </m:r>
           <m:d>
             <m:dPr>
@@ -2748,7 +2874,13 @@
             <w:rPr>
               <w:rFonts w:eastAsiaTheme="minorEastAsia"/>
             </w:rPr>
-            <m:t>=a</m:t>
+            <m:t>=</m:t>
+          </m:r>
+          <m:r>
+            <w:rPr>
+              <w:rFonts w:eastAsiaTheme="minorEastAsia"/>
+            </w:rPr>
+            <m:t>a</m:t>
           </m:r>
           <m:d>
             <m:dPr>
@@ -2852,7 +2984,13 @@
             <w:rPr>
               <w:rFonts w:eastAsiaTheme="minorEastAsia"/>
             </w:rPr>
-            <m:t>+b</m:t>
+            <m:t>+</m:t>
+          </m:r>
+          <m:r>
+            <w:rPr>
+              <w:rFonts w:eastAsiaTheme="minorEastAsia"/>
+            </w:rPr>
+            <m:t>b</m:t>
           </m:r>
           <m:d>
             <m:dPr>
@@ -3004,7 +3142,13 @@
                     <w:rPr>
                       <w:rFonts w:eastAsiaTheme="minorEastAsia"/>
                     </w:rPr>
-                    <m:t>-πi</m:t>
+                    <m:t>-</m:t>
+                  </m:r>
+                  <m:r>
+                    <w:rPr>
+                      <w:rFonts w:eastAsiaTheme="minorEastAsia"/>
+                    </w:rPr>
+                    <m:t>πi</m:t>
                   </m:r>
                   <m:r>
                     <m:rPr>
@@ -3093,7 +3237,13 @@
                         <w:rPr>
                           <w:rFonts w:eastAsiaTheme="minorEastAsia"/>
                         </w:rPr>
-                        <m:t>1+i</m:t>
+                        <m:t>1+</m:t>
+                      </m:r>
+                      <m:r>
+                        <w:rPr>
+                          <w:rFonts w:eastAsiaTheme="minorEastAsia"/>
+                        </w:rPr>
+                        <m:t>i</m:t>
                       </m:r>
                     </m:e>
                   </m:d>
@@ -3137,7 +3287,13 @@
                         <w:rPr>
                           <w:rFonts w:eastAsiaTheme="minorEastAsia"/>
                         </w:rPr>
-                        <m:t>1-i</m:t>
+                        <m:t>1-</m:t>
+                      </m:r>
+                      <m:r>
+                        <w:rPr>
+                          <w:rFonts w:eastAsiaTheme="minorEastAsia"/>
+                        </w:rPr>
+                        <m:t>i</m:t>
                       </m:r>
                     </m:e>
                   </m:d>
@@ -3187,7 +3343,13 @@
                 <w:rPr>
                   <w:rFonts w:eastAsiaTheme="minorEastAsia"/>
                 </w:rPr>
-                <m:t>+b</m:t>
+                <m:t>+</m:t>
+              </m:r>
+              <m:r>
+                <w:rPr>
+                  <w:rFonts w:eastAsiaTheme="minorEastAsia"/>
+                </w:rPr>
+                <m:t>b</m:t>
               </m:r>
               <m:d>
                 <m:dPr>
@@ -3233,7 +3395,13 @@
                         <w:rPr>
                           <w:rFonts w:eastAsiaTheme="minorEastAsia"/>
                         </w:rPr>
-                        <m:t>1-i</m:t>
+                        <m:t>1-</m:t>
+                      </m:r>
+                      <m:r>
+                        <w:rPr>
+                          <w:rFonts w:eastAsiaTheme="minorEastAsia"/>
+                        </w:rPr>
+                        <m:t>i</m:t>
                       </m:r>
                     </m:e>
                   </m:d>
@@ -3277,7 +3445,13 @@
                         <w:rPr>
                           <w:rFonts w:eastAsiaTheme="minorEastAsia"/>
                         </w:rPr>
-                        <m:t>1+i</m:t>
+                        <m:t>1+</m:t>
+                      </m:r>
+                      <m:r>
+                        <w:rPr>
+                          <w:rFonts w:eastAsiaTheme="minorEastAsia"/>
+                        </w:rPr>
+                        <m:t>i</m:t>
                       </m:r>
                     </m:e>
                   </m:d>
@@ -3377,7 +3551,13 @@
                     <w:rPr>
                       <w:rFonts w:eastAsiaTheme="minorEastAsia"/>
                     </w:rPr>
-                    <m:t>-πi</m:t>
+                    <m:t>-</m:t>
+                  </m:r>
+                  <m:r>
+                    <w:rPr>
+                      <w:rFonts w:eastAsiaTheme="minorEastAsia"/>
+                    </w:rPr>
+                    <m:t>πi</m:t>
                   </m:r>
                   <m:r>
                     <m:rPr>
@@ -3436,7 +3616,13 @@
                     <w:rPr>
                       <w:rFonts w:eastAsiaTheme="minorEastAsia"/>
                     </w:rPr>
-                    <m:t>1+i</m:t>
+                    <m:t>1+</m:t>
+                  </m:r>
+                  <m:r>
+                    <w:rPr>
+                      <w:rFonts w:eastAsiaTheme="minorEastAsia"/>
+                    </w:rPr>
+                    <m:t>i</m:t>
                   </m:r>
                 </m:e>
               </m:d>
@@ -3464,23 +3650,35 @@
                 <w:rPr>
                   <w:rFonts w:eastAsiaTheme="minorEastAsia"/>
                 </w:rPr>
-                <m:t>+a</m:t>
-              </m:r>
-              <m:d>
-                <m:dPr>
-                  <m:ctrlPr>
-                    <w:rPr>
-                      <w:rFonts w:eastAsiaTheme="minorEastAsia"/>
-                      <w:i/>
-                    </w:rPr>
-                  </m:ctrlPr>
-                </m:dPr>
-                <m:e>
-                  <m:r>
-                    <w:rPr>
-                      <w:rFonts w:eastAsiaTheme="minorEastAsia"/>
-                    </w:rPr>
-                    <m:t>1-i</m:t>
+                <m:t>+</m:t>
+              </m:r>
+              <m:r>
+                <w:rPr>
+                  <w:rFonts w:eastAsiaTheme="minorEastAsia"/>
+                </w:rPr>
+                <m:t>a</m:t>
+              </m:r>
+              <m:d>
+                <m:dPr>
+                  <m:ctrlPr>
+                    <w:rPr>
+                      <w:rFonts w:eastAsiaTheme="minorEastAsia"/>
+                      <w:i/>
+                    </w:rPr>
+                  </m:ctrlPr>
+                </m:dPr>
+                <m:e>
+                  <m:r>
+                    <w:rPr>
+                      <w:rFonts w:eastAsiaTheme="minorEastAsia"/>
+                    </w:rPr>
+                    <m:t>1-</m:t>
+                  </m:r>
+                  <m:r>
+                    <w:rPr>
+                      <w:rFonts w:eastAsiaTheme="minorEastAsia"/>
+                    </w:rPr>
+                    <m:t>i</m:t>
                   </m:r>
                 </m:e>
               </m:d>
@@ -3508,23 +3706,35 @@
                 <w:rPr>
                   <w:rFonts w:eastAsiaTheme="minorEastAsia"/>
                 </w:rPr>
-                <m:t>+b</m:t>
-              </m:r>
-              <m:d>
-                <m:dPr>
-                  <m:ctrlPr>
-                    <w:rPr>
-                      <w:rFonts w:eastAsiaTheme="minorEastAsia"/>
-                      <w:i/>
-                    </w:rPr>
-                  </m:ctrlPr>
-                </m:dPr>
-                <m:e>
-                  <m:r>
-                    <w:rPr>
-                      <w:rFonts w:eastAsiaTheme="minorEastAsia"/>
-                    </w:rPr>
-                    <m:t>1-i</m:t>
+                <m:t>+</m:t>
+              </m:r>
+              <m:r>
+                <w:rPr>
+                  <w:rFonts w:eastAsiaTheme="minorEastAsia"/>
+                </w:rPr>
+                <m:t>b</m:t>
+              </m:r>
+              <m:d>
+                <m:dPr>
+                  <m:ctrlPr>
+                    <w:rPr>
+                      <w:rFonts w:eastAsiaTheme="minorEastAsia"/>
+                      <w:i/>
+                    </w:rPr>
+                  </m:ctrlPr>
+                </m:dPr>
+                <m:e>
+                  <m:r>
+                    <w:rPr>
+                      <w:rFonts w:eastAsiaTheme="minorEastAsia"/>
+                    </w:rPr>
+                    <m:t>1-</m:t>
+                  </m:r>
+                  <m:r>
+                    <w:rPr>
+                      <w:rFonts w:eastAsiaTheme="minorEastAsia"/>
+                    </w:rPr>
+                    <m:t>i</m:t>
                   </m:r>
                 </m:e>
               </m:d>
@@ -3552,23 +3762,35 @@
                 <w:rPr>
                   <w:rFonts w:eastAsiaTheme="minorEastAsia"/>
                 </w:rPr>
-                <m:t>+b</m:t>
-              </m:r>
-              <m:d>
-                <m:dPr>
-                  <m:ctrlPr>
-                    <w:rPr>
-                      <w:rFonts w:eastAsiaTheme="minorEastAsia"/>
-                      <w:i/>
-                    </w:rPr>
-                  </m:ctrlPr>
-                </m:dPr>
-                <m:e>
-                  <m:r>
-                    <w:rPr>
-                      <w:rFonts w:eastAsiaTheme="minorEastAsia"/>
-                    </w:rPr>
-                    <m:t>1+i</m:t>
+                <m:t>+</m:t>
+              </m:r>
+              <m:r>
+                <w:rPr>
+                  <w:rFonts w:eastAsiaTheme="minorEastAsia"/>
+                </w:rPr>
+                <m:t>b</m:t>
+              </m:r>
+              <m:d>
+                <m:dPr>
+                  <m:ctrlPr>
+                    <w:rPr>
+                      <w:rFonts w:eastAsiaTheme="minorEastAsia"/>
+                      <w:i/>
+                    </w:rPr>
+                  </m:ctrlPr>
+                </m:dPr>
+                <m:e>
+                  <m:r>
+                    <w:rPr>
+                      <w:rFonts w:eastAsiaTheme="minorEastAsia"/>
+                    </w:rPr>
+                    <m:t>1+</m:t>
+                  </m:r>
+                  <m:r>
+                    <w:rPr>
+                      <w:rFonts w:eastAsiaTheme="minorEastAsia"/>
+                    </w:rPr>
+                    <m:t>i</m:t>
                   </m:r>
                 </m:e>
               </m:d>
@@ -3727,7 +3949,13 @@
                     <w:rPr>
                       <w:rFonts w:eastAsiaTheme="minorEastAsia"/>
                     </w:rPr>
-                    <m:t>-πi</m:t>
+                    <m:t>-</m:t>
+                  </m:r>
+                  <m:r>
+                    <w:rPr>
+                      <w:rFonts w:eastAsiaTheme="minorEastAsia"/>
+                    </w:rPr>
+                    <m:t>πi</m:t>
                   </m:r>
                   <m:r>
                     <m:rPr>
@@ -3816,7 +4044,13 @@
                         <w:rPr>
                           <w:rFonts w:eastAsiaTheme="minorEastAsia"/>
                         </w:rPr>
-                        <m:t>1+i</m:t>
+                        <m:t>1+</m:t>
+                      </m:r>
+                      <m:r>
+                        <w:rPr>
+                          <w:rFonts w:eastAsiaTheme="minorEastAsia"/>
+                        </w:rPr>
+                        <m:t>i</m:t>
                       </m:r>
                     </m:e>
                   </m:d>
@@ -3866,7 +4100,13 @@
                         <w:rPr>
                           <w:rFonts w:eastAsiaTheme="minorEastAsia"/>
                         </w:rPr>
-                        <m:t>1-i</m:t>
+                        <m:t>1-</m:t>
+                      </m:r>
+                      <m:r>
+                        <w:rPr>
+                          <w:rFonts w:eastAsiaTheme="minorEastAsia"/>
+                        </w:rPr>
+                        <m:t>i</m:t>
                       </m:r>
                     </m:e>
                   </m:d>
@@ -3928,7 +4168,13 @@
                 <w:rPr>
                   <w:rFonts w:eastAsiaTheme="minorEastAsia"/>
                 </w:rPr>
-                <m:t>+b</m:t>
+                <m:t>+</m:t>
+              </m:r>
+              <m:r>
+                <w:rPr>
+                  <w:rFonts w:eastAsiaTheme="minorEastAsia"/>
+                </w:rPr>
+                <m:t>b</m:t>
               </m:r>
               <m:d>
                 <m:dPr>
@@ -3974,7 +4220,13 @@
                         <w:rPr>
                           <w:rFonts w:eastAsiaTheme="minorEastAsia"/>
                         </w:rPr>
-                        <m:t>1-i</m:t>
+                        <m:t>1-</m:t>
+                      </m:r>
+                      <m:r>
+                        <w:rPr>
+                          <w:rFonts w:eastAsiaTheme="minorEastAsia"/>
+                        </w:rPr>
+                        <m:t>i</m:t>
                       </m:r>
                     </m:e>
                   </m:d>
@@ -4024,7 +4276,13 @@
                         <w:rPr>
                           <w:rFonts w:eastAsiaTheme="minorEastAsia"/>
                         </w:rPr>
-                        <m:t>1+i</m:t>
+                        <m:t>1+</m:t>
+                      </m:r>
+                      <m:r>
+                        <w:rPr>
+                          <w:rFonts w:eastAsiaTheme="minorEastAsia"/>
+                        </w:rPr>
+                        <m:t>i</m:t>
                       </m:r>
                     </m:e>
                   </m:d>
@@ -4136,7 +4394,13 @@
                     <w:rPr>
                       <w:rFonts w:eastAsiaTheme="minorEastAsia"/>
                     </w:rPr>
-                    <m:t>-πi</m:t>
+                    <m:t>-</m:t>
+                  </m:r>
+                  <m:r>
+                    <w:rPr>
+                      <w:rFonts w:eastAsiaTheme="minorEastAsia"/>
+                    </w:rPr>
+                    <m:t>πi</m:t>
                   </m:r>
                   <m:r>
                     <m:rPr>
@@ -4225,7 +4489,13 @@
                         <w:rPr>
                           <w:rFonts w:eastAsiaTheme="minorEastAsia"/>
                         </w:rPr>
-                        <m:t>1+i</m:t>
+                        <m:t>1+</m:t>
+                      </m:r>
+                      <m:r>
+                        <w:rPr>
+                          <w:rFonts w:eastAsiaTheme="minorEastAsia"/>
+                        </w:rPr>
+                        <m:t>i</m:t>
                       </m:r>
                     </m:e>
                   </m:d>
@@ -4269,7 +4539,13 @@
                         <w:rPr>
                           <w:rFonts w:eastAsiaTheme="minorEastAsia"/>
                         </w:rPr>
-                        <m:t>1-i</m:t>
+                        <m:t>1-</m:t>
+                      </m:r>
+                      <m:r>
+                        <w:rPr>
+                          <w:rFonts w:eastAsiaTheme="minorEastAsia"/>
+                        </w:rPr>
+                        <m:t>i</m:t>
                       </m:r>
                     </m:e>
                   </m:d>
@@ -4319,7 +4595,13 @@
                 <w:rPr>
                   <w:rFonts w:eastAsiaTheme="minorEastAsia"/>
                 </w:rPr>
-                <m:t>+b</m:t>
+                <m:t>+</m:t>
+              </m:r>
+              <m:r>
+                <w:rPr>
+                  <w:rFonts w:eastAsiaTheme="minorEastAsia"/>
+                </w:rPr>
+                <m:t>b</m:t>
               </m:r>
               <m:d>
                 <m:dPr>
@@ -4365,7 +4647,13 @@
                         <w:rPr>
                           <w:rFonts w:eastAsiaTheme="minorEastAsia"/>
                         </w:rPr>
-                        <m:t>1-i</m:t>
+                        <m:t>1-</m:t>
+                      </m:r>
+                      <m:r>
+                        <w:rPr>
+                          <w:rFonts w:eastAsiaTheme="minorEastAsia"/>
+                        </w:rPr>
+                        <m:t>i</m:t>
                       </m:r>
                     </m:e>
                   </m:d>
@@ -4409,7 +4697,13 @@
                         <w:rPr>
                           <w:rFonts w:eastAsiaTheme="minorEastAsia"/>
                         </w:rPr>
-                        <m:t>1+i</m:t>
+                        <m:t>1+</m:t>
+                      </m:r>
+                      <m:r>
+                        <w:rPr>
+                          <w:rFonts w:eastAsiaTheme="minorEastAsia"/>
+                        </w:rPr>
+                        <m:t>i</m:t>
                       </m:r>
                     </m:e>
                   </m:d>
@@ -4509,7 +4803,13 @@
                     <w:rPr>
                       <w:rFonts w:eastAsiaTheme="minorEastAsia"/>
                     </w:rPr>
-                    <m:t>-πi</m:t>
+                    <m:t>-</m:t>
+                  </m:r>
+                  <m:r>
+                    <w:rPr>
+                      <w:rFonts w:eastAsiaTheme="minorEastAsia"/>
+                    </w:rPr>
+                    <m:t>πi</m:t>
                   </m:r>
                   <m:r>
                     <m:rPr>
@@ -4618,7 +4918,13 @@
                         <w:rPr>
                           <w:rFonts w:eastAsiaTheme="minorEastAsia"/>
                         </w:rPr>
-                        <m:t>1+i</m:t>
+                        <m:t>1+</m:t>
+                      </m:r>
+                      <m:r>
+                        <w:rPr>
+                          <w:rFonts w:eastAsiaTheme="minorEastAsia"/>
+                        </w:rPr>
+                        <m:t>i</m:t>
                       </m:r>
                     </m:e>
                   </m:d>
@@ -4662,7 +4968,13 @@
                         <w:rPr>
                           <w:rFonts w:eastAsiaTheme="minorEastAsia"/>
                         </w:rPr>
-                        <m:t>1-i</m:t>
+                        <m:t>1-</m:t>
+                      </m:r>
+                      <m:r>
+                        <w:rPr>
+                          <w:rFonts w:eastAsiaTheme="minorEastAsia"/>
+                        </w:rPr>
+                        <m:t>i</m:t>
                       </m:r>
                     </m:e>
                   </m:d>
@@ -4750,7 +5062,13 @@
                 <w:rPr>
                   <w:rFonts w:eastAsiaTheme="minorEastAsia"/>
                 </w:rPr>
-                <m:t>+b</m:t>
+                <m:t>+</m:t>
+              </m:r>
+              <m:r>
+                <w:rPr>
+                  <w:rFonts w:eastAsiaTheme="minorEastAsia"/>
+                </w:rPr>
+                <m:t>b</m:t>
               </m:r>
               <m:d>
                 <m:dPr>
@@ -4796,7 +5114,13 @@
                         <w:rPr>
                           <w:rFonts w:eastAsiaTheme="minorEastAsia"/>
                         </w:rPr>
-                        <m:t>1-i</m:t>
+                        <m:t>1-</m:t>
+                      </m:r>
+                      <m:r>
+                        <w:rPr>
+                          <w:rFonts w:eastAsiaTheme="minorEastAsia"/>
+                        </w:rPr>
+                        <m:t>i</m:t>
                       </m:r>
                     </m:e>
                   </m:d>
@@ -4840,7 +5164,13 @@
                         <w:rPr>
                           <w:rFonts w:eastAsiaTheme="minorEastAsia"/>
                         </w:rPr>
-                        <m:t>1+i</m:t>
+                        <m:t>1+</m:t>
+                      </m:r>
+                      <m:r>
+                        <w:rPr>
+                          <w:rFonts w:eastAsiaTheme="minorEastAsia"/>
+                        </w:rPr>
+                        <m:t>i</m:t>
                       </m:r>
                     </m:e>
                   </m:d>
@@ -4978,7 +5308,13 @@
                     <w:rPr>
                       <w:rFonts w:eastAsiaTheme="minorEastAsia"/>
                     </w:rPr>
-                    <m:t>-πi</m:t>
+                    <m:t>-</m:t>
+                  </m:r>
+                  <m:r>
+                    <w:rPr>
+                      <w:rFonts w:eastAsiaTheme="minorEastAsia"/>
+                    </w:rPr>
+                    <m:t>πi</m:t>
                   </m:r>
                   <m:r>
                     <m:rPr>
@@ -5087,7 +5423,13 @@
                         <w:rPr>
                           <w:rFonts w:eastAsiaTheme="minorEastAsia"/>
                         </w:rPr>
-                        <m:t>1+i</m:t>
+                        <m:t>1+</m:t>
+                      </m:r>
+                      <m:r>
+                        <w:rPr>
+                          <w:rFonts w:eastAsiaTheme="minorEastAsia"/>
+                        </w:rPr>
+                        <m:t>i</m:t>
                       </m:r>
                     </m:e>
                   </m:d>
@@ -5131,7 +5473,13 @@
                         <w:rPr>
                           <w:rFonts w:eastAsiaTheme="minorEastAsia"/>
                         </w:rPr>
-                        <m:t>1-i</m:t>
+                        <m:t>1-</m:t>
+                      </m:r>
+                      <m:r>
+                        <w:rPr>
+                          <w:rFonts w:eastAsiaTheme="minorEastAsia"/>
+                        </w:rPr>
+                        <m:t>i</m:t>
                       </m:r>
                     </m:e>
                   </m:d>
@@ -5181,7 +5529,13 @@
                 <w:rPr>
                   <w:rFonts w:eastAsiaTheme="minorEastAsia"/>
                 </w:rPr>
-                <m:t>+a</m:t>
+                <m:t>+</m:t>
+              </m:r>
+              <m:r>
+                <w:rPr>
+                  <w:rFonts w:eastAsiaTheme="minorEastAsia"/>
+                </w:rPr>
+                <m:t>a</m:t>
               </m:r>
               <m:d>
                 <m:dPr>
@@ -5227,7 +5581,13 @@
                         <w:rPr>
                           <w:rFonts w:eastAsiaTheme="minorEastAsia"/>
                         </w:rPr>
-                        <m:t>1+i</m:t>
+                        <m:t>1+</m:t>
+                      </m:r>
+                      <m:r>
+                        <w:rPr>
+                          <w:rFonts w:eastAsiaTheme="minorEastAsia"/>
+                        </w:rPr>
+                        <m:t>i</m:t>
                       </m:r>
                     </m:e>
                   </m:d>
@@ -5271,7 +5631,13 @@
                         <w:rPr>
                           <w:rFonts w:eastAsiaTheme="minorEastAsia"/>
                         </w:rPr>
-                        <m:t>1-i</m:t>
+                        <m:t>1-</m:t>
+                      </m:r>
+                      <m:r>
+                        <w:rPr>
+                          <w:rFonts w:eastAsiaTheme="minorEastAsia"/>
+                        </w:rPr>
+                        <m:t>i</m:t>
                       </m:r>
                     </m:e>
                   </m:d>
@@ -5321,7 +5687,13 @@
                 <w:rPr>
                   <w:rFonts w:eastAsiaTheme="minorEastAsia"/>
                 </w:rPr>
-                <m:t>+b</m:t>
+                <m:t>+</m:t>
+              </m:r>
+              <m:r>
+                <w:rPr>
+                  <w:rFonts w:eastAsiaTheme="minorEastAsia"/>
+                </w:rPr>
+                <m:t>b</m:t>
               </m:r>
               <m:d>
                 <m:dPr>
@@ -5367,7 +5739,13 @@
                         <w:rPr>
                           <w:rFonts w:eastAsiaTheme="minorEastAsia"/>
                         </w:rPr>
-                        <m:t>1-i</m:t>
+                        <m:t>1-</m:t>
+                      </m:r>
+                      <m:r>
+                        <w:rPr>
+                          <w:rFonts w:eastAsiaTheme="minorEastAsia"/>
+                        </w:rPr>
+                        <m:t>i</m:t>
                       </m:r>
                     </m:e>
                   </m:d>
@@ -5411,7 +5789,13 @@
                         <w:rPr>
                           <w:rFonts w:eastAsiaTheme="minorEastAsia"/>
                         </w:rPr>
-                        <m:t>1+i</m:t>
+                        <m:t>1+</m:t>
+                      </m:r>
+                      <m:r>
+                        <w:rPr>
+                          <w:rFonts w:eastAsiaTheme="minorEastAsia"/>
+                        </w:rPr>
+                        <m:t>i</m:t>
                       </m:r>
                     </m:e>
                   </m:d>
@@ -5461,7 +5845,13 @@
                 <w:rPr>
                   <w:rFonts w:eastAsiaTheme="minorEastAsia"/>
                 </w:rPr>
-                <m:t>+b</m:t>
+                <m:t>+</m:t>
+              </m:r>
+              <m:r>
+                <w:rPr>
+                  <w:rFonts w:eastAsiaTheme="minorEastAsia"/>
+                </w:rPr>
+                <m:t>b</m:t>
               </m:r>
               <m:d>
                 <m:dPr>
@@ -5507,7 +5897,13 @@
                         <w:rPr>
                           <w:rFonts w:eastAsiaTheme="minorEastAsia"/>
                         </w:rPr>
-                        <m:t>1-i</m:t>
+                        <m:t>1-</m:t>
+                      </m:r>
+                      <m:r>
+                        <w:rPr>
+                          <w:rFonts w:eastAsiaTheme="minorEastAsia"/>
+                        </w:rPr>
+                        <m:t>i</m:t>
                       </m:r>
                     </m:e>
                   </m:d>
@@ -5551,7 +5947,13 @@
                         <w:rPr>
                           <w:rFonts w:eastAsiaTheme="minorEastAsia"/>
                         </w:rPr>
-                        <m:t>1+i</m:t>
+                        <m:t>1+</m:t>
+                      </m:r>
+                      <m:r>
+                        <w:rPr>
+                          <w:rFonts w:eastAsiaTheme="minorEastAsia"/>
+                        </w:rPr>
+                        <m:t>i</m:t>
                       </m:r>
                     </m:e>
                   </m:d>
@@ -5764,7 +6166,13 @@
                     <w:rPr>
                       <w:rFonts w:eastAsiaTheme="minorEastAsia"/>
                     </w:rPr>
-                    <m:t>-πi</m:t>
+                    <m:t>-</m:t>
+                  </m:r>
+                  <m:r>
+                    <w:rPr>
+                      <w:rFonts w:eastAsiaTheme="minorEastAsia"/>
+                    </w:rPr>
+                    <m:t>πi</m:t>
                   </m:r>
                   <m:r>
                     <m:rPr>
@@ -5873,7 +6281,13 @@
                         <w:rPr>
                           <w:rFonts w:eastAsiaTheme="minorEastAsia"/>
                         </w:rPr>
-                        <m:t>1+i</m:t>
+                        <m:t>1+</m:t>
+                      </m:r>
+                      <m:r>
+                        <w:rPr>
+                          <w:rFonts w:eastAsiaTheme="minorEastAsia"/>
+                        </w:rPr>
+                        <m:t>i</m:t>
                       </m:r>
                     </m:e>
                   </m:d>
@@ -5917,7 +6331,13 @@
                         <w:rPr>
                           <w:rFonts w:eastAsiaTheme="minorEastAsia"/>
                         </w:rPr>
-                        <m:t>1-i</m:t>
+                        <m:t>1-</m:t>
+                      </m:r>
+                      <m:r>
+                        <w:rPr>
+                          <w:rFonts w:eastAsiaTheme="minorEastAsia"/>
+                        </w:rPr>
+                        <m:t>i</m:t>
                       </m:r>
                     </m:e>
                   </m:d>
@@ -5967,7 +6387,13 @@
                 <w:rPr>
                   <w:rFonts w:eastAsiaTheme="minorEastAsia"/>
                 </w:rPr>
-                <m:t>+a</m:t>
+                <m:t>+</m:t>
+              </m:r>
+              <m:r>
+                <w:rPr>
+                  <w:rFonts w:eastAsiaTheme="minorEastAsia"/>
+                </w:rPr>
+                <m:t>a</m:t>
               </m:r>
               <m:d>
                 <m:dPr>
@@ -6051,7 +6477,13 @@
                         <w:rPr>
                           <w:rFonts w:eastAsiaTheme="minorEastAsia"/>
                         </w:rPr>
-                        <m:t>1+i</m:t>
+                        <m:t>1+</m:t>
+                      </m:r>
+                      <m:r>
+                        <w:rPr>
+                          <w:rFonts w:eastAsiaTheme="minorEastAsia"/>
+                        </w:rPr>
+                        <m:t>i</m:t>
                       </m:r>
                     </m:e>
                   </m:d>
@@ -6095,7 +6527,13 @@
                         <w:rPr>
                           <w:rFonts w:eastAsiaTheme="minorEastAsia"/>
                         </w:rPr>
-                        <m:t>1-i</m:t>
+                        <m:t>1-</m:t>
+                      </m:r>
+                      <m:r>
+                        <w:rPr>
+                          <w:rFonts w:eastAsiaTheme="minorEastAsia"/>
+                        </w:rPr>
+                        <m:t>i</m:t>
                       </m:r>
                     </m:e>
                   </m:d>
@@ -6145,7 +6583,13 @@
                 <w:rPr>
                   <w:rFonts w:eastAsiaTheme="minorEastAsia"/>
                 </w:rPr>
-                <m:t>+b</m:t>
+                <m:t>+</m:t>
+              </m:r>
+              <m:r>
+                <w:rPr>
+                  <w:rFonts w:eastAsiaTheme="minorEastAsia"/>
+                </w:rPr>
+                <m:t>b</m:t>
               </m:r>
               <m:d>
                 <m:dPr>
@@ -6191,7 +6635,13 @@
                         <w:rPr>
                           <w:rFonts w:eastAsiaTheme="minorEastAsia"/>
                         </w:rPr>
-                        <m:t>1-i</m:t>
+                        <m:t>1-</m:t>
+                      </m:r>
+                      <m:r>
+                        <w:rPr>
+                          <w:rFonts w:eastAsiaTheme="minorEastAsia"/>
+                        </w:rPr>
+                        <m:t>i</m:t>
                       </m:r>
                     </m:e>
                   </m:d>
@@ -6235,7 +6685,13 @@
                         <w:rPr>
                           <w:rFonts w:eastAsiaTheme="minorEastAsia"/>
                         </w:rPr>
-                        <m:t>1+i</m:t>
+                        <m:t>1+</m:t>
+                      </m:r>
+                      <m:r>
+                        <w:rPr>
+                          <w:rFonts w:eastAsiaTheme="minorEastAsia"/>
+                        </w:rPr>
+                        <m:t>i</m:t>
                       </m:r>
                     </m:e>
                   </m:d>
@@ -6285,7 +6741,13 @@
                 <w:rPr>
                   <w:rFonts w:eastAsiaTheme="minorEastAsia"/>
                 </w:rPr>
-                <m:t>+b</m:t>
+                <m:t>+</m:t>
+              </m:r>
+              <m:r>
+                <w:rPr>
+                  <w:rFonts w:eastAsiaTheme="minorEastAsia"/>
+                </w:rPr>
+                <m:t>b</m:t>
               </m:r>
               <m:d>
                 <m:dPr>
@@ -6369,7 +6831,13 @@
                         <w:rPr>
                           <w:rFonts w:eastAsiaTheme="minorEastAsia"/>
                         </w:rPr>
-                        <m:t>1-i</m:t>
+                        <m:t>1-</m:t>
+                      </m:r>
+                      <m:r>
+                        <w:rPr>
+                          <w:rFonts w:eastAsiaTheme="minorEastAsia"/>
+                        </w:rPr>
+                        <m:t>i</m:t>
                       </m:r>
                     </m:e>
                   </m:d>
@@ -6413,7 +6881,13 @@
                         <w:rPr>
                           <w:rFonts w:eastAsiaTheme="minorEastAsia"/>
                         </w:rPr>
-                        <m:t>1+i</m:t>
+                        <m:t>1+</m:t>
+                      </m:r>
+                      <m:r>
+                        <w:rPr>
+                          <w:rFonts w:eastAsiaTheme="minorEastAsia"/>
+                        </w:rPr>
+                        <m:t>i</m:t>
                       </m:r>
                     </m:e>
                   </m:d>
@@ -6513,7 +6987,13 @@
                     <w:rPr>
                       <w:rFonts w:eastAsiaTheme="minorEastAsia"/>
                     </w:rPr>
-                    <m:t>-πi</m:t>
+                    <m:t>-</m:t>
+                  </m:r>
+                  <m:r>
+                    <w:rPr>
+                      <w:rFonts w:eastAsiaTheme="minorEastAsia"/>
+                    </w:rPr>
+                    <m:t>πi</m:t>
                   </m:r>
                   <m:r>
                     <m:rPr>
@@ -6622,7 +7102,13 @@
                         <w:rPr>
                           <w:rFonts w:eastAsiaTheme="minorEastAsia"/>
                         </w:rPr>
-                        <m:t>1+i</m:t>
+                        <m:t>1+</m:t>
+                      </m:r>
+                      <m:r>
+                        <w:rPr>
+                          <w:rFonts w:eastAsiaTheme="minorEastAsia"/>
+                        </w:rPr>
+                        <m:t>i</m:t>
                       </m:r>
                     </m:e>
                   </m:d>
@@ -6666,7 +7152,13 @@
                         <w:rPr>
                           <w:rFonts w:eastAsiaTheme="minorEastAsia"/>
                         </w:rPr>
-                        <m:t>1-i</m:t>
+                        <m:t>1-</m:t>
+                      </m:r>
+                      <m:r>
+                        <w:rPr>
+                          <w:rFonts w:eastAsiaTheme="minorEastAsia"/>
+                        </w:rPr>
+                        <m:t>i</m:t>
                       </m:r>
                     </m:e>
                   </m:d>
@@ -6716,7 +7208,13 @@
                 <w:rPr>
                   <w:rFonts w:eastAsiaTheme="minorEastAsia"/>
                 </w:rPr>
-                <m:t>+a</m:t>
+                <m:t>+</m:t>
+              </m:r>
+              <m:r>
+                <w:rPr>
+                  <w:rFonts w:eastAsiaTheme="minorEastAsia"/>
+                </w:rPr>
+                <m:t>a</m:t>
               </m:r>
               <m:d>
                 <m:dPr>
@@ -6762,7 +7260,13 @@
                         <w:rPr>
                           <w:rFonts w:eastAsiaTheme="minorEastAsia"/>
                         </w:rPr>
-                        <m:t>1+i</m:t>
+                        <m:t>1+</m:t>
+                      </m:r>
+                      <m:r>
+                        <w:rPr>
+                          <w:rFonts w:eastAsiaTheme="minorEastAsia"/>
+                        </w:rPr>
+                        <m:t>i</m:t>
                       </m:r>
                     </m:e>
                   </m:d>
@@ -6806,7 +7310,13 @@
                         <w:rPr>
                           <w:rFonts w:eastAsiaTheme="minorEastAsia"/>
                         </w:rPr>
-                        <m:t>1-i</m:t>
+                        <m:t>1-</m:t>
+                      </m:r>
+                      <m:r>
+                        <w:rPr>
+                          <w:rFonts w:eastAsiaTheme="minorEastAsia"/>
+                        </w:rPr>
+                        <m:t>i</m:t>
                       </m:r>
                     </m:e>
                   </m:d>
@@ -6856,7 +7366,13 @@
                 <w:rPr>
                   <w:rFonts w:eastAsiaTheme="minorEastAsia"/>
                 </w:rPr>
-                <m:t>+b</m:t>
+                <m:t>+</m:t>
+              </m:r>
+              <m:r>
+                <w:rPr>
+                  <w:rFonts w:eastAsiaTheme="minorEastAsia"/>
+                </w:rPr>
+                <m:t>b</m:t>
               </m:r>
               <m:d>
                 <m:dPr>
@@ -6902,7 +7418,13 @@
                         <w:rPr>
                           <w:rFonts w:eastAsiaTheme="minorEastAsia"/>
                         </w:rPr>
-                        <m:t>1-i</m:t>
+                        <m:t>1-</m:t>
+                      </m:r>
+                      <m:r>
+                        <w:rPr>
+                          <w:rFonts w:eastAsiaTheme="minorEastAsia"/>
+                        </w:rPr>
+                        <m:t>i</m:t>
                       </m:r>
                     </m:e>
                   </m:d>
@@ -6946,7 +7468,13 @@
                         <w:rPr>
                           <w:rFonts w:eastAsiaTheme="minorEastAsia"/>
                         </w:rPr>
-                        <m:t>1+i</m:t>
+                        <m:t>1+</m:t>
+                      </m:r>
+                      <m:r>
+                        <w:rPr>
+                          <w:rFonts w:eastAsiaTheme="minorEastAsia"/>
+                        </w:rPr>
+                        <m:t>i</m:t>
                       </m:r>
                     </m:e>
                   </m:d>
@@ -6996,7 +7524,13 @@
                 <w:rPr>
                   <w:rFonts w:eastAsiaTheme="minorEastAsia"/>
                 </w:rPr>
-                <m:t>+b</m:t>
+                <m:t>+</m:t>
+              </m:r>
+              <m:r>
+                <w:rPr>
+                  <w:rFonts w:eastAsiaTheme="minorEastAsia"/>
+                </w:rPr>
+                <m:t>b</m:t>
               </m:r>
               <m:d>
                 <m:dPr>
@@ -7042,7 +7576,13 @@
                         <w:rPr>
                           <w:rFonts w:eastAsiaTheme="minorEastAsia"/>
                         </w:rPr>
-                        <m:t>1-i</m:t>
+                        <m:t>1-</m:t>
+                      </m:r>
+                      <m:r>
+                        <w:rPr>
+                          <w:rFonts w:eastAsiaTheme="minorEastAsia"/>
+                        </w:rPr>
+                        <m:t>i</m:t>
                       </m:r>
                     </m:e>
                   </m:d>
@@ -7086,7 +7626,13 @@
                         <w:rPr>
                           <w:rFonts w:eastAsiaTheme="minorEastAsia"/>
                         </w:rPr>
-                        <m:t>1+i</m:t>
+                        <m:t>1+</m:t>
+                      </m:r>
+                      <m:r>
+                        <w:rPr>
+                          <w:rFonts w:eastAsiaTheme="minorEastAsia"/>
+                        </w:rPr>
+                        <m:t>i</m:t>
                       </m:r>
                     </m:e>
                   </m:d>
@@ -7156,7 +7702,13 @@
           <w:rPr>
             <w:rFonts w:eastAsiaTheme="minorEastAsia"/>
           </w:rPr>
-          <m:t>t=8</m:t>
+          <m:t>t</m:t>
+        </m:r>
+        <m:r>
+          <w:rPr>
+            <w:rFonts w:eastAsiaTheme="minorEastAsia"/>
+          </w:rPr>
+          <m:t>=8</m:t>
         </m:r>
       </m:oMath>
       <w:r>
@@ -7170,7 +7722,13 @@
           <w:rPr>
             <w:rFonts w:eastAsiaTheme="minorEastAsia"/>
           </w:rPr>
-          <m:t>I⊗</m:t>
+          <m:t>I</m:t>
+        </m:r>
+        <m:r>
+          <w:rPr>
+            <w:rFonts w:eastAsiaTheme="minorEastAsia"/>
+          </w:rPr>
+          <m:t>⊗</m:t>
         </m:r>
         <m:sSup>
           <m:sSupPr>
@@ -7194,7 +7752,13 @@
               <w:rPr>
                 <w:rFonts w:eastAsiaTheme="minorEastAsia"/>
               </w:rPr>
-              <m:t>-1</m:t>
+              <m:t>-</m:t>
+            </m:r>
+            <m:r>
+              <w:rPr>
+                <w:rFonts w:eastAsiaTheme="minorEastAsia"/>
+              </w:rPr>
+              <m:t>1</m:t>
             </m:r>
           </m:sup>
         </m:sSup>
@@ -7202,7 +7766,13 @@
           <w:rPr>
             <w:rFonts w:eastAsiaTheme="minorEastAsia"/>
           </w:rPr>
-          <m:t>⊗H</m:t>
+          <m:t>⊗</m:t>
+        </m:r>
+        <m:r>
+          <w:rPr>
+            <w:rFonts w:eastAsiaTheme="minorEastAsia"/>
+          </w:rPr>
+          <m:t>H</m:t>
         </m:r>
       </m:oMath>
       <w:r>
@@ -7301,7 +7871,13 @@
                     <w:rPr>
                       <w:rFonts w:eastAsiaTheme="minorEastAsia"/>
                     </w:rPr>
-                    <m:t>-πi</m:t>
+                    <m:t>-</m:t>
+                  </m:r>
+                  <m:r>
+                    <w:rPr>
+                      <w:rFonts w:eastAsiaTheme="minorEastAsia"/>
+                    </w:rPr>
+                    <m:t>πi</m:t>
                   </m:r>
                   <m:r>
                     <m:rPr>
@@ -7408,7 +7984,13 @@
                     <w:rPr>
                       <w:rFonts w:eastAsiaTheme="minorEastAsia"/>
                     </w:rPr>
-                    <m:t>-1</m:t>
+                    <m:t>-</m:t>
+                  </m:r>
+                  <m:r>
+                    <w:rPr>
+                      <w:rFonts w:eastAsiaTheme="minorEastAsia"/>
+                    </w:rPr>
+                    <m:t>1</m:t>
                   </m:r>
                 </m:sup>
               </m:sSup>
@@ -7436,7 +8018,13 @@
                         <w:rPr>
                           <w:rFonts w:eastAsiaTheme="minorEastAsia"/>
                         </w:rPr>
-                        <m:t>1+i</m:t>
+                        <m:t>1+</m:t>
+                      </m:r>
+                      <m:r>
+                        <w:rPr>
+                          <w:rFonts w:eastAsiaTheme="minorEastAsia"/>
+                        </w:rPr>
+                        <m:t>i</m:t>
                       </m:r>
                     </m:e>
                   </m:d>
@@ -7480,7 +8068,13 @@
                         <w:rPr>
                           <w:rFonts w:eastAsiaTheme="minorEastAsia"/>
                         </w:rPr>
-                        <m:t>1-i</m:t>
+                        <m:t>1-</m:t>
+                      </m:r>
+                      <m:r>
+                        <w:rPr>
+                          <w:rFonts w:eastAsiaTheme="minorEastAsia"/>
+                        </w:rPr>
+                        <m:t>i</m:t>
                       </m:r>
                     </m:e>
                   </m:d>
@@ -7536,7 +8130,13 @@
                 <w:rPr>
                   <w:rFonts w:eastAsiaTheme="minorEastAsia"/>
                 </w:rPr>
-                <m:t>+a</m:t>
+                <m:t>+</m:t>
+              </m:r>
+              <m:r>
+                <w:rPr>
+                  <w:rFonts w:eastAsiaTheme="minorEastAsia"/>
+                </w:rPr>
+                <m:t>a</m:t>
               </m:r>
               <m:d>
                 <m:dPr>
@@ -7580,7 +8180,13 @@
                     <w:rPr>
                       <w:rFonts w:eastAsiaTheme="minorEastAsia"/>
                     </w:rPr>
-                    <m:t>-1</m:t>
+                    <m:t>-</m:t>
+                  </m:r>
+                  <m:r>
+                    <w:rPr>
+                      <w:rFonts w:eastAsiaTheme="minorEastAsia"/>
+                    </w:rPr>
+                    <m:t>1</m:t>
                   </m:r>
                 </m:sup>
               </m:sSup>
@@ -7608,7 +8214,13 @@
                         <w:rPr>
                           <w:rFonts w:eastAsiaTheme="minorEastAsia"/>
                         </w:rPr>
-                        <m:t>1+i</m:t>
+                        <m:t>1+</m:t>
+                      </m:r>
+                      <m:r>
+                        <w:rPr>
+                          <w:rFonts w:eastAsiaTheme="minorEastAsia"/>
+                        </w:rPr>
+                        <m:t>i</m:t>
                       </m:r>
                     </m:e>
                   </m:d>
@@ -7652,7 +8264,13 @@
                         <w:rPr>
                           <w:rFonts w:eastAsiaTheme="minorEastAsia"/>
                         </w:rPr>
-                        <m:t>1-i</m:t>
+                        <m:t>1-</m:t>
+                      </m:r>
+                      <m:r>
+                        <w:rPr>
+                          <w:rFonts w:eastAsiaTheme="minorEastAsia"/>
+                        </w:rPr>
+                        <m:t>i</m:t>
                       </m:r>
                     </m:e>
                   </m:d>
@@ -7708,7 +8326,13 @@
                 <w:rPr>
                   <w:rFonts w:eastAsiaTheme="minorEastAsia"/>
                 </w:rPr>
-                <m:t>+b</m:t>
+                <m:t>+</m:t>
+              </m:r>
+              <m:r>
+                <w:rPr>
+                  <w:rFonts w:eastAsiaTheme="minorEastAsia"/>
+                </w:rPr>
+                <m:t>b</m:t>
               </m:r>
               <m:d>
                 <m:dPr>
@@ -7752,7 +8376,13 @@
                     <w:rPr>
                       <w:rFonts w:eastAsiaTheme="minorEastAsia"/>
                     </w:rPr>
-                    <m:t>-1</m:t>
+                    <m:t>-</m:t>
+                  </m:r>
+                  <m:r>
+                    <w:rPr>
+                      <w:rFonts w:eastAsiaTheme="minorEastAsia"/>
+                    </w:rPr>
+                    <m:t>1</m:t>
                   </m:r>
                 </m:sup>
               </m:sSup>
@@ -7780,7 +8410,13 @@
                         <w:rPr>
                           <w:rFonts w:eastAsiaTheme="minorEastAsia"/>
                         </w:rPr>
-                        <m:t>1-i</m:t>
+                        <m:t>1-</m:t>
+                      </m:r>
+                      <m:r>
+                        <w:rPr>
+                          <w:rFonts w:eastAsiaTheme="minorEastAsia"/>
+                        </w:rPr>
+                        <m:t>i</m:t>
                       </m:r>
                     </m:e>
                   </m:d>
@@ -7824,7 +8460,13 @@
                         <w:rPr>
                           <w:rFonts w:eastAsiaTheme="minorEastAsia"/>
                         </w:rPr>
-                        <m:t>1+i</m:t>
+                        <m:t>1+</m:t>
+                      </m:r>
+                      <m:r>
+                        <w:rPr>
+                          <w:rFonts w:eastAsiaTheme="minorEastAsia"/>
+                        </w:rPr>
+                        <m:t>i</m:t>
                       </m:r>
                     </m:e>
                   </m:d>
@@ -7880,7 +8522,13 @@
                 <w:rPr>
                   <w:rFonts w:eastAsiaTheme="minorEastAsia"/>
                 </w:rPr>
-                <m:t>+b</m:t>
+                <m:t>+</m:t>
+              </m:r>
+              <m:r>
+                <w:rPr>
+                  <w:rFonts w:eastAsiaTheme="minorEastAsia"/>
+                </w:rPr>
+                <m:t>b</m:t>
               </m:r>
               <m:d>
                 <m:dPr>
@@ -7924,7 +8572,13 @@
                     <w:rPr>
                       <w:rFonts w:eastAsiaTheme="minorEastAsia"/>
                     </w:rPr>
-                    <m:t>-1</m:t>
+                    <m:t>-</m:t>
+                  </m:r>
+                  <m:r>
+                    <w:rPr>
+                      <w:rFonts w:eastAsiaTheme="minorEastAsia"/>
+                    </w:rPr>
+                    <m:t>1</m:t>
                   </m:r>
                 </m:sup>
               </m:sSup>
@@ -7952,7 +8606,13 @@
                         <w:rPr>
                           <w:rFonts w:eastAsiaTheme="minorEastAsia"/>
                         </w:rPr>
-                        <m:t>1-i</m:t>
+                        <m:t>1-</m:t>
+                      </m:r>
+                      <m:r>
+                        <w:rPr>
+                          <w:rFonts w:eastAsiaTheme="minorEastAsia"/>
+                        </w:rPr>
+                        <m:t>i</m:t>
                       </m:r>
                     </m:e>
                   </m:d>
@@ -7996,7 +8656,13 @@
                         <w:rPr>
                           <w:rFonts w:eastAsiaTheme="minorEastAsia"/>
                         </w:rPr>
-                        <m:t>1+i</m:t>
+                        <m:t>1+</m:t>
+                      </m:r>
+                      <m:r>
+                        <w:rPr>
+                          <w:rFonts w:eastAsiaTheme="minorEastAsia"/>
+                        </w:rPr>
+                        <m:t>i</m:t>
                       </m:r>
                     </m:e>
                   </m:d>
@@ -8102,7 +8768,13 @@
                     <w:rPr>
                       <w:rFonts w:eastAsiaTheme="minorEastAsia"/>
                     </w:rPr>
-                    <m:t>-πi</m:t>
+                    <m:t>-</m:t>
+                  </m:r>
+                  <m:r>
+                    <w:rPr>
+                      <w:rFonts w:eastAsiaTheme="minorEastAsia"/>
+                    </w:rPr>
+                    <m:t>πi</m:t>
                   </m:r>
                   <m:r>
                     <m:rPr>
@@ -8211,7 +8883,13 @@
                         <w:rPr>
                           <w:rFonts w:eastAsiaTheme="minorEastAsia"/>
                         </w:rPr>
-                        <m:t>1+i</m:t>
+                        <m:t>1+</m:t>
+                      </m:r>
+                      <m:r>
+                        <w:rPr>
+                          <w:rFonts w:eastAsiaTheme="minorEastAsia"/>
+                        </w:rPr>
+                        <m:t>i</m:t>
                       </m:r>
                     </m:e>
                   </m:d>
@@ -8255,7 +8933,13 @@
                         <w:rPr>
                           <w:rFonts w:eastAsiaTheme="minorEastAsia"/>
                         </w:rPr>
-                        <m:t>1-i</m:t>
+                        <m:t>1-</m:t>
+                      </m:r>
+                      <m:r>
+                        <w:rPr>
+                          <w:rFonts w:eastAsiaTheme="minorEastAsia"/>
+                        </w:rPr>
+                        <m:t>i</m:t>
                       </m:r>
                     </m:e>
                   </m:d>
@@ -8305,7 +8989,13 @@
                 <w:rPr>
                   <w:rFonts w:eastAsiaTheme="minorEastAsia"/>
                 </w:rPr>
-                <m:t>+a</m:t>
+                <m:t>+</m:t>
+              </m:r>
+              <m:r>
+                <w:rPr>
+                  <w:rFonts w:eastAsiaTheme="minorEastAsia"/>
+                </w:rPr>
+                <m:t>a</m:t>
               </m:r>
               <m:d>
                 <m:dPr>
@@ -8351,7 +9041,13 @@
                         <w:rPr>
                           <w:rFonts w:eastAsiaTheme="minorEastAsia"/>
                         </w:rPr>
-                        <m:t>1+i</m:t>
+                        <m:t>1+</m:t>
+                      </m:r>
+                      <m:r>
+                        <w:rPr>
+                          <w:rFonts w:eastAsiaTheme="minorEastAsia"/>
+                        </w:rPr>
+                        <m:t>i</m:t>
                       </m:r>
                     </m:e>
                   </m:d>
@@ -8395,7 +9091,13 @@
                         <w:rPr>
                           <w:rFonts w:eastAsiaTheme="minorEastAsia"/>
                         </w:rPr>
-                        <m:t>1-i</m:t>
+                        <m:t>1-</m:t>
+                      </m:r>
+                      <m:r>
+                        <w:rPr>
+                          <w:rFonts w:eastAsiaTheme="minorEastAsia"/>
+                        </w:rPr>
+                        <m:t>i</m:t>
                       </m:r>
                     </m:e>
                   </m:d>
@@ -8445,7 +9147,13 @@
                 <w:rPr>
                   <w:rFonts w:eastAsiaTheme="minorEastAsia"/>
                 </w:rPr>
-                <m:t>+b</m:t>
+                <m:t>+</m:t>
+              </m:r>
+              <m:r>
+                <w:rPr>
+                  <w:rFonts w:eastAsiaTheme="minorEastAsia"/>
+                </w:rPr>
+                <m:t>b</m:t>
               </m:r>
               <m:d>
                 <m:dPr>
@@ -8491,7 +9199,13 @@
                         <w:rPr>
                           <w:rFonts w:eastAsiaTheme="minorEastAsia"/>
                         </w:rPr>
-                        <m:t>1-i</m:t>
+                        <m:t>1-</m:t>
+                      </m:r>
+                      <m:r>
+                        <w:rPr>
+                          <w:rFonts w:eastAsiaTheme="minorEastAsia"/>
+                        </w:rPr>
+                        <m:t>i</m:t>
                       </m:r>
                     </m:e>
                   </m:d>
@@ -8535,7 +9249,13 @@
                         <w:rPr>
                           <w:rFonts w:eastAsiaTheme="minorEastAsia"/>
                         </w:rPr>
-                        <m:t>1+i</m:t>
+                        <m:t>1+</m:t>
+                      </m:r>
+                      <m:r>
+                        <w:rPr>
+                          <w:rFonts w:eastAsiaTheme="minorEastAsia"/>
+                        </w:rPr>
+                        <m:t>i</m:t>
                       </m:r>
                     </m:e>
                   </m:d>
@@ -8585,7 +9305,13 @@
                 <w:rPr>
                   <w:rFonts w:eastAsiaTheme="minorEastAsia"/>
                 </w:rPr>
-                <m:t>+b</m:t>
+                <m:t>+</m:t>
+              </m:r>
+              <m:r>
+                <w:rPr>
+                  <w:rFonts w:eastAsiaTheme="minorEastAsia"/>
+                </w:rPr>
+                <m:t>b</m:t>
               </m:r>
               <m:d>
                 <m:dPr>
@@ -8631,7 +9357,13 @@
                         <w:rPr>
                           <w:rFonts w:eastAsiaTheme="minorEastAsia"/>
                         </w:rPr>
-                        <m:t>1-i</m:t>
+                        <m:t>1-</m:t>
+                      </m:r>
+                      <m:r>
+                        <w:rPr>
+                          <w:rFonts w:eastAsiaTheme="minorEastAsia"/>
+                        </w:rPr>
+                        <m:t>i</m:t>
                       </m:r>
                     </m:e>
                   </m:d>
@@ -8675,7 +9407,13 @@
                         <w:rPr>
                           <w:rFonts w:eastAsiaTheme="minorEastAsia"/>
                         </w:rPr>
-                        <m:t>1+i</m:t>
+                        <m:t>1+</m:t>
+                      </m:r>
+                      <m:r>
+                        <w:rPr>
+                          <w:rFonts w:eastAsiaTheme="minorEastAsia"/>
+                        </w:rPr>
+                        <m:t>i</m:t>
                       </m:r>
                     </m:e>
                   </m:d>
@@ -8775,7 +9513,13 @@
                     <w:rPr>
                       <w:rFonts w:eastAsiaTheme="minorEastAsia"/>
                     </w:rPr>
-                    <m:t>-πi</m:t>
+                    <m:t>-</m:t>
+                  </m:r>
+                  <m:r>
+                    <w:rPr>
+                      <w:rFonts w:eastAsiaTheme="minorEastAsia"/>
+                    </w:rPr>
+                    <m:t>πi</m:t>
                   </m:r>
                   <m:r>
                     <m:rPr>
@@ -8864,7 +9608,13 @@
                         <w:rPr>
                           <w:rFonts w:eastAsiaTheme="minorEastAsia"/>
                         </w:rPr>
-                        <m:t>1+i</m:t>
+                        <m:t>1+</m:t>
+                      </m:r>
+                      <m:r>
+                        <w:rPr>
+                          <w:rFonts w:eastAsiaTheme="minorEastAsia"/>
+                        </w:rPr>
+                        <m:t>i</m:t>
                       </m:r>
                     </m:e>
                   </m:d>
@@ -8908,7 +9658,13 @@
                         <w:rPr>
                           <w:rFonts w:eastAsiaTheme="minorEastAsia"/>
                         </w:rPr>
-                        <m:t>1-i</m:t>
+                        <m:t>1-</m:t>
+                      </m:r>
+                      <m:r>
+                        <w:rPr>
+                          <w:rFonts w:eastAsiaTheme="minorEastAsia"/>
+                        </w:rPr>
+                        <m:t>i</m:t>
                       </m:r>
                     </m:e>
                   </m:d>
@@ -8996,7 +9752,13 @@
                 <w:rPr>
                   <w:rFonts w:eastAsiaTheme="minorEastAsia"/>
                 </w:rPr>
-                <m:t>+a</m:t>
+                <m:t>+</m:t>
+              </m:r>
+              <m:r>
+                <w:rPr>
+                  <w:rFonts w:eastAsiaTheme="minorEastAsia"/>
+                </w:rPr>
+                <m:t>a</m:t>
               </m:r>
               <m:d>
                 <m:dPr>
@@ -9042,7 +9804,13 @@
                         <w:rPr>
                           <w:rFonts w:eastAsiaTheme="minorEastAsia"/>
                         </w:rPr>
-                        <m:t>1+i</m:t>
+                        <m:t>1+</m:t>
+                      </m:r>
+                      <m:r>
+                        <w:rPr>
+                          <w:rFonts w:eastAsiaTheme="minorEastAsia"/>
+                        </w:rPr>
+                        <m:t>i</m:t>
                       </m:r>
                     </m:e>
                   </m:d>
@@ -9086,7 +9854,13 @@
                         <w:rPr>
                           <w:rFonts w:eastAsiaTheme="minorEastAsia"/>
                         </w:rPr>
-                        <m:t>1-i</m:t>
+                        <m:t>1-</m:t>
+                      </m:r>
+                      <m:r>
+                        <w:rPr>
+                          <w:rFonts w:eastAsiaTheme="minorEastAsia"/>
+                        </w:rPr>
+                        <m:t>i</m:t>
                       </m:r>
                     </m:e>
                   </m:d>
@@ -9174,7 +9948,13 @@
                 <w:rPr>
                   <w:rFonts w:eastAsiaTheme="minorEastAsia"/>
                 </w:rPr>
-                <m:t>+b</m:t>
+                <m:t>+</m:t>
+              </m:r>
+              <m:r>
+                <w:rPr>
+                  <w:rFonts w:eastAsiaTheme="minorEastAsia"/>
+                </w:rPr>
+                <m:t>b</m:t>
               </m:r>
               <m:d>
                 <m:dPr>
@@ -9220,7 +10000,13 @@
                         <w:rPr>
                           <w:rFonts w:eastAsiaTheme="minorEastAsia"/>
                         </w:rPr>
-                        <m:t>1-i</m:t>
+                        <m:t>1-</m:t>
+                      </m:r>
+                      <m:r>
+                        <w:rPr>
+                          <w:rFonts w:eastAsiaTheme="minorEastAsia"/>
+                        </w:rPr>
+                        <m:t>i</m:t>
                       </m:r>
                     </m:e>
                   </m:d>
@@ -9264,7 +10050,13 @@
                         <w:rPr>
                           <w:rFonts w:eastAsiaTheme="minorEastAsia"/>
                         </w:rPr>
-                        <m:t>1+i</m:t>
+                        <m:t>1+</m:t>
+                      </m:r>
+                      <m:r>
+                        <w:rPr>
+                          <w:rFonts w:eastAsiaTheme="minorEastAsia"/>
+                        </w:rPr>
+                        <m:t>i</m:t>
                       </m:r>
                     </m:e>
                   </m:d>
@@ -9352,7 +10144,13 @@
                 <w:rPr>
                   <w:rFonts w:eastAsiaTheme="minorEastAsia"/>
                 </w:rPr>
-                <m:t>+b</m:t>
+                <m:t>+</m:t>
+              </m:r>
+              <m:r>
+                <w:rPr>
+                  <w:rFonts w:eastAsiaTheme="minorEastAsia"/>
+                </w:rPr>
+                <m:t>b</m:t>
               </m:r>
               <m:d>
                 <m:dPr>
@@ -9398,7 +10196,13 @@
                         <w:rPr>
                           <w:rFonts w:eastAsiaTheme="minorEastAsia"/>
                         </w:rPr>
-                        <m:t>1-i</m:t>
+                        <m:t>1-</m:t>
+                      </m:r>
+                      <m:r>
+                        <w:rPr>
+                          <w:rFonts w:eastAsiaTheme="minorEastAsia"/>
+                        </w:rPr>
+                        <m:t>i</m:t>
                       </m:r>
                     </m:e>
                   </m:d>
@@ -9442,7 +10246,13 @@
                         <w:rPr>
                           <w:rFonts w:eastAsiaTheme="minorEastAsia"/>
                         </w:rPr>
-                        <m:t>1+i</m:t>
+                        <m:t>1+</m:t>
+                      </m:r>
+                      <m:r>
+                        <w:rPr>
+                          <w:rFonts w:eastAsiaTheme="minorEastAsia"/>
+                        </w:rPr>
+                        <m:t>i</m:t>
                       </m:r>
                     </m:e>
                   </m:d>
@@ -9580,7 +10390,13 @@
                     <w:rPr>
                       <w:rFonts w:eastAsiaTheme="minorEastAsia"/>
                     </w:rPr>
-                    <m:t>-πi</m:t>
+                    <m:t>-</m:t>
+                  </m:r>
+                  <m:r>
+                    <w:rPr>
+                      <w:rFonts w:eastAsiaTheme="minorEastAsia"/>
+                    </w:rPr>
+                    <m:t>πi</m:t>
                   </m:r>
                   <m:r>
                     <m:rPr>
@@ -9649,7 +10465,13 @@
                         <w:rPr>
                           <w:rFonts w:eastAsiaTheme="minorEastAsia"/>
                         </w:rPr>
-                        <m:t>1+i</m:t>
+                        <m:t>1+</m:t>
+                      </m:r>
+                      <m:r>
+                        <w:rPr>
+                          <w:rFonts w:eastAsiaTheme="minorEastAsia"/>
+                        </w:rPr>
+                        <m:t>i</m:t>
                       </m:r>
                     </m:e>
                   </m:d>
@@ -9693,7 +10515,13 @@
                         <w:rPr>
                           <w:rFonts w:eastAsiaTheme="minorEastAsia"/>
                         </w:rPr>
-                        <m:t>1+i</m:t>
+                        <m:t>1+</m:t>
+                      </m:r>
+                      <m:r>
+                        <w:rPr>
+                          <w:rFonts w:eastAsiaTheme="minorEastAsia"/>
+                        </w:rPr>
+                        <m:t>i</m:t>
                       </m:r>
                     </m:e>
                   </m:d>
@@ -9737,7 +10565,13 @@
                         <w:rPr>
                           <w:rFonts w:eastAsiaTheme="minorEastAsia"/>
                         </w:rPr>
-                        <m:t>1-i</m:t>
+                        <m:t>1-</m:t>
+                      </m:r>
+                      <m:r>
+                        <w:rPr>
+                          <w:rFonts w:eastAsiaTheme="minorEastAsia"/>
+                        </w:rPr>
+                        <m:t>i</m:t>
                       </m:r>
                     </m:e>
                   </m:d>
@@ -9781,7 +10615,13 @@
                         <w:rPr>
                           <w:rFonts w:eastAsiaTheme="minorEastAsia"/>
                         </w:rPr>
-                        <m:t>1-i</m:t>
+                        <m:t>1-</m:t>
+                      </m:r>
+                      <m:r>
+                        <w:rPr>
+                          <w:rFonts w:eastAsiaTheme="minorEastAsia"/>
+                        </w:rPr>
+                        <m:t>i</m:t>
                       </m:r>
                     </m:e>
                   </m:d>
@@ -9811,33 +10651,45 @@
                 <w:rPr>
                   <w:rFonts w:eastAsiaTheme="minorEastAsia"/>
                 </w:rPr>
-                <m:t>+a</m:t>
-              </m:r>
-              <m:d>
-                <m:dPr>
-                  <m:ctrlPr>
-                    <w:rPr>
-                      <w:rFonts w:eastAsiaTheme="minorEastAsia"/>
-                      <w:i/>
-                    </w:rPr>
-                  </m:ctrlPr>
-                </m:dPr>
-                <m:e>
-                  <m:d>
-                    <m:dPr>
-                      <m:ctrlPr>
-                        <w:rPr>
-                          <w:rFonts w:eastAsiaTheme="minorEastAsia"/>
-                          <w:i/>
-                        </w:rPr>
-                      </m:ctrlPr>
-                    </m:dPr>
-                    <m:e>
-                      <m:r>
-                        <w:rPr>
-                          <w:rFonts w:eastAsiaTheme="minorEastAsia"/>
-                        </w:rPr>
-                        <m:t>1+i</m:t>
+                <m:t>+</m:t>
+              </m:r>
+              <m:r>
+                <w:rPr>
+                  <w:rFonts w:eastAsiaTheme="minorEastAsia"/>
+                </w:rPr>
+                <m:t>a</m:t>
+              </m:r>
+              <m:d>
+                <m:dPr>
+                  <m:ctrlPr>
+                    <w:rPr>
+                      <w:rFonts w:eastAsiaTheme="minorEastAsia"/>
+                      <w:i/>
+                    </w:rPr>
+                  </m:ctrlPr>
+                </m:dPr>
+                <m:e>
+                  <m:d>
+                    <m:dPr>
+                      <m:ctrlPr>
+                        <w:rPr>
+                          <w:rFonts w:eastAsiaTheme="minorEastAsia"/>
+                          <w:i/>
+                        </w:rPr>
+                      </m:ctrlPr>
+                    </m:dPr>
+                    <m:e>
+                      <m:r>
+                        <w:rPr>
+                          <w:rFonts w:eastAsiaTheme="minorEastAsia"/>
+                        </w:rPr>
+                        <m:t>1+</m:t>
+                      </m:r>
+                      <m:r>
+                        <w:rPr>
+                          <w:rFonts w:eastAsiaTheme="minorEastAsia"/>
+                        </w:rPr>
+                        <m:t>i</m:t>
                       </m:r>
                     </m:e>
                   </m:d>
@@ -9881,7 +10733,13 @@
                         <w:rPr>
                           <w:rFonts w:eastAsiaTheme="minorEastAsia"/>
                         </w:rPr>
-                        <m:t>1+i</m:t>
+                        <m:t>1+</m:t>
+                      </m:r>
+                      <m:r>
+                        <w:rPr>
+                          <w:rFonts w:eastAsiaTheme="minorEastAsia"/>
+                        </w:rPr>
+                        <m:t>i</m:t>
                       </m:r>
                     </m:e>
                   </m:d>
@@ -9925,7 +10783,13 @@
                         <w:rPr>
                           <w:rFonts w:eastAsiaTheme="minorEastAsia"/>
                         </w:rPr>
-                        <m:t>1-i</m:t>
+                        <m:t>1-</m:t>
+                      </m:r>
+                      <m:r>
+                        <w:rPr>
+                          <w:rFonts w:eastAsiaTheme="minorEastAsia"/>
+                        </w:rPr>
+                        <m:t>i</m:t>
                       </m:r>
                     </m:e>
                   </m:d>
@@ -9969,7 +10833,13 @@
                         <w:rPr>
                           <w:rFonts w:eastAsiaTheme="minorEastAsia"/>
                         </w:rPr>
-                        <m:t>1-i</m:t>
+                        <m:t>1-</m:t>
+                      </m:r>
+                      <m:r>
+                        <w:rPr>
+                          <w:rFonts w:eastAsiaTheme="minorEastAsia"/>
+                        </w:rPr>
+                        <m:t>i</m:t>
                       </m:r>
                     </m:e>
                   </m:d>
@@ -9999,33 +10869,45 @@
                 <w:rPr>
                   <w:rFonts w:eastAsiaTheme="minorEastAsia"/>
                 </w:rPr>
-                <m:t>+b</m:t>
-              </m:r>
-              <m:d>
-                <m:dPr>
-                  <m:ctrlPr>
-                    <w:rPr>
-                      <w:rFonts w:eastAsiaTheme="minorEastAsia"/>
-                      <w:i/>
-                    </w:rPr>
-                  </m:ctrlPr>
-                </m:dPr>
-                <m:e>
-                  <m:d>
-                    <m:dPr>
-                      <m:ctrlPr>
-                        <w:rPr>
-                          <w:rFonts w:eastAsiaTheme="minorEastAsia"/>
-                          <w:i/>
-                        </w:rPr>
-                      </m:ctrlPr>
-                    </m:dPr>
-                    <m:e>
-                      <m:r>
-                        <w:rPr>
-                          <w:rFonts w:eastAsiaTheme="minorEastAsia"/>
-                        </w:rPr>
-                        <m:t>1-i</m:t>
+                <m:t>+</m:t>
+              </m:r>
+              <m:r>
+                <w:rPr>
+                  <w:rFonts w:eastAsiaTheme="minorEastAsia"/>
+                </w:rPr>
+                <m:t>b</m:t>
+              </m:r>
+              <m:d>
+                <m:dPr>
+                  <m:ctrlPr>
+                    <w:rPr>
+                      <w:rFonts w:eastAsiaTheme="minorEastAsia"/>
+                      <w:i/>
+                    </w:rPr>
+                  </m:ctrlPr>
+                </m:dPr>
+                <m:e>
+                  <m:d>
+                    <m:dPr>
+                      <m:ctrlPr>
+                        <w:rPr>
+                          <w:rFonts w:eastAsiaTheme="minorEastAsia"/>
+                          <w:i/>
+                        </w:rPr>
+                      </m:ctrlPr>
+                    </m:dPr>
+                    <m:e>
+                      <m:r>
+                        <w:rPr>
+                          <w:rFonts w:eastAsiaTheme="minorEastAsia"/>
+                        </w:rPr>
+                        <m:t>1-</m:t>
+                      </m:r>
+                      <m:r>
+                        <w:rPr>
+                          <w:rFonts w:eastAsiaTheme="minorEastAsia"/>
+                        </w:rPr>
+                        <m:t>i</m:t>
                       </m:r>
                     </m:e>
                   </m:d>
@@ -10069,7 +10951,13 @@
                         <w:rPr>
                           <w:rFonts w:eastAsiaTheme="minorEastAsia"/>
                         </w:rPr>
-                        <m:t>1-i</m:t>
+                        <m:t>1-</m:t>
+                      </m:r>
+                      <m:r>
+                        <w:rPr>
+                          <w:rFonts w:eastAsiaTheme="minorEastAsia"/>
+                        </w:rPr>
+                        <m:t>i</m:t>
                       </m:r>
                     </m:e>
                   </m:d>
@@ -10113,7 +11001,13 @@
                         <w:rPr>
                           <w:rFonts w:eastAsiaTheme="minorEastAsia"/>
                         </w:rPr>
-                        <m:t>1+i</m:t>
+                        <m:t>1+</m:t>
+                      </m:r>
+                      <m:r>
+                        <w:rPr>
+                          <w:rFonts w:eastAsiaTheme="minorEastAsia"/>
+                        </w:rPr>
+                        <m:t>i</m:t>
                       </m:r>
                     </m:e>
                   </m:d>
@@ -10157,7 +11051,13 @@
                         <w:rPr>
                           <w:rFonts w:eastAsiaTheme="minorEastAsia"/>
                         </w:rPr>
-                        <m:t>1+i</m:t>
+                        <m:t>1+</m:t>
+                      </m:r>
+                      <m:r>
+                        <w:rPr>
+                          <w:rFonts w:eastAsiaTheme="minorEastAsia"/>
+                        </w:rPr>
+                        <m:t>i</m:t>
                       </m:r>
                     </m:e>
                   </m:d>
@@ -10187,33 +11087,45 @@
                 <w:rPr>
                   <w:rFonts w:eastAsiaTheme="minorEastAsia"/>
                 </w:rPr>
-                <m:t>+b</m:t>
-              </m:r>
-              <m:d>
-                <m:dPr>
-                  <m:ctrlPr>
-                    <w:rPr>
-                      <w:rFonts w:eastAsiaTheme="minorEastAsia"/>
-                      <w:i/>
-                    </w:rPr>
-                  </m:ctrlPr>
-                </m:dPr>
-                <m:e>
-                  <m:d>
-                    <m:dPr>
-                      <m:ctrlPr>
-                        <w:rPr>
-                          <w:rFonts w:eastAsiaTheme="minorEastAsia"/>
-                          <w:i/>
-                        </w:rPr>
-                      </m:ctrlPr>
-                    </m:dPr>
-                    <m:e>
-                      <m:r>
-                        <w:rPr>
-                          <w:rFonts w:eastAsiaTheme="minorEastAsia"/>
-                        </w:rPr>
-                        <m:t>1-i</m:t>
+                <m:t>+</m:t>
+              </m:r>
+              <m:r>
+                <w:rPr>
+                  <w:rFonts w:eastAsiaTheme="minorEastAsia"/>
+                </w:rPr>
+                <m:t>b</m:t>
+              </m:r>
+              <m:d>
+                <m:dPr>
+                  <m:ctrlPr>
+                    <w:rPr>
+                      <w:rFonts w:eastAsiaTheme="minorEastAsia"/>
+                      <w:i/>
+                    </w:rPr>
+                  </m:ctrlPr>
+                </m:dPr>
+                <m:e>
+                  <m:d>
+                    <m:dPr>
+                      <m:ctrlPr>
+                        <w:rPr>
+                          <w:rFonts w:eastAsiaTheme="minorEastAsia"/>
+                          <w:i/>
+                        </w:rPr>
+                      </m:ctrlPr>
+                    </m:dPr>
+                    <m:e>
+                      <m:r>
+                        <w:rPr>
+                          <w:rFonts w:eastAsiaTheme="minorEastAsia"/>
+                        </w:rPr>
+                        <m:t>1-</m:t>
+                      </m:r>
+                      <m:r>
+                        <w:rPr>
+                          <w:rFonts w:eastAsiaTheme="minorEastAsia"/>
+                        </w:rPr>
+                        <m:t>i</m:t>
                       </m:r>
                     </m:e>
                   </m:d>
@@ -10257,7 +11169,13 @@
                         <w:rPr>
                           <w:rFonts w:eastAsiaTheme="minorEastAsia"/>
                         </w:rPr>
-                        <m:t>1-i</m:t>
+                        <m:t>1-</m:t>
+                      </m:r>
+                      <m:r>
+                        <w:rPr>
+                          <w:rFonts w:eastAsiaTheme="minorEastAsia"/>
+                        </w:rPr>
+                        <m:t>i</m:t>
                       </m:r>
                     </m:e>
                   </m:d>
@@ -10301,7 +11219,13 @@
                         <w:rPr>
                           <w:rFonts w:eastAsiaTheme="minorEastAsia"/>
                         </w:rPr>
-                        <m:t>1+i</m:t>
+                        <m:t>1+</m:t>
+                      </m:r>
+                      <m:r>
+                        <w:rPr>
+                          <w:rFonts w:eastAsiaTheme="minorEastAsia"/>
+                        </w:rPr>
+                        <m:t>i</m:t>
                       </m:r>
                     </m:e>
                   </m:d>
@@ -10345,7 +11269,13 @@
                         <w:rPr>
                           <w:rFonts w:eastAsiaTheme="minorEastAsia"/>
                         </w:rPr>
-                        <m:t>1+i</m:t>
+                        <m:t>1+</m:t>
+                      </m:r>
+                      <m:r>
+                        <w:rPr>
+                          <w:rFonts w:eastAsiaTheme="minorEastAsia"/>
+                        </w:rPr>
+                        <m:t>i</m:t>
                       </m:r>
                     </m:e>
                   </m:d>
@@ -10425,7 +11355,13 @@
                     <w:rPr>
                       <w:rFonts w:eastAsiaTheme="minorEastAsia"/>
                     </w:rPr>
-                    <m:t>-πi</m:t>
+                    <m:t>-</m:t>
+                  </m:r>
+                  <m:r>
+                    <w:rPr>
+                      <w:rFonts w:eastAsiaTheme="minorEastAsia"/>
+                    </w:rPr>
+                    <m:t>πi</m:t>
                   </m:r>
                   <m:r>
                     <m:rPr>
@@ -10504,7 +11440,13 @@
                             <w:rPr>
                               <w:rFonts w:eastAsiaTheme="minorEastAsia"/>
                             </w:rPr>
-                            <m:t>1+i</m:t>
+                            <m:t>1+</m:t>
+                          </m:r>
+                          <m:r>
+                            <w:rPr>
+                              <w:rFonts w:eastAsiaTheme="minorEastAsia"/>
+                            </w:rPr>
+                            <m:t>i</m:t>
                           </m:r>
                         </m:e>
                       </m:d>
@@ -10528,7 +11470,13 @@
                             <w:rPr>
                               <w:rFonts w:eastAsiaTheme="minorEastAsia"/>
                             </w:rPr>
-                            <m:t>1-i</m:t>
+                            <m:t>1-</m:t>
+                          </m:r>
+                          <m:r>
+                            <w:rPr>
+                              <w:rFonts w:eastAsiaTheme="minorEastAsia"/>
+                            </w:rPr>
+                            <m:t>i</m:t>
                           </m:r>
                         </m:e>
                       </m:d>
@@ -10584,7 +11532,13 @@
                             <w:rPr>
                               <w:rFonts w:eastAsiaTheme="minorEastAsia"/>
                             </w:rPr>
-                            <m:t>1+i</m:t>
+                            <m:t>1+</m:t>
+                          </m:r>
+                          <m:r>
+                            <w:rPr>
+                              <w:rFonts w:eastAsiaTheme="minorEastAsia"/>
+                            </w:rPr>
+                            <m:t>i</m:t>
                           </m:r>
                         </m:e>
                       </m:d>
@@ -10608,7 +11562,13 @@
                             <w:rPr>
                               <w:rFonts w:eastAsiaTheme="minorEastAsia"/>
                             </w:rPr>
-                            <m:t>1-i</m:t>
+                            <m:t>1-</m:t>
+                          </m:r>
+                          <m:r>
+                            <w:rPr>
+                              <w:rFonts w:eastAsiaTheme="minorEastAsia"/>
+                            </w:rPr>
+                            <m:t>i</m:t>
                           </m:r>
                         </m:e>
                       </m:d>
@@ -10664,7 +11624,13 @@
                             <w:rPr>
                               <w:rFonts w:eastAsiaTheme="minorEastAsia"/>
                             </w:rPr>
-                            <m:t>1-i</m:t>
+                            <m:t>1-</m:t>
+                          </m:r>
+                          <m:r>
+                            <w:rPr>
+                              <w:rFonts w:eastAsiaTheme="minorEastAsia"/>
+                            </w:rPr>
+                            <m:t>i</m:t>
                           </m:r>
                         </m:e>
                       </m:d>
@@ -10688,7 +11654,13 @@
                             <w:rPr>
                               <w:rFonts w:eastAsiaTheme="minorEastAsia"/>
                             </w:rPr>
-                            <m:t>1+i</m:t>
+                            <m:t>1+</m:t>
+                          </m:r>
+                          <m:r>
+                            <w:rPr>
+                              <w:rFonts w:eastAsiaTheme="minorEastAsia"/>
+                            </w:rPr>
+                            <m:t>i</m:t>
                           </m:r>
                         </m:e>
                       </m:d>
@@ -10744,7 +11716,13 @@
                             <w:rPr>
                               <w:rFonts w:eastAsiaTheme="minorEastAsia"/>
                             </w:rPr>
-                            <m:t>1-i</m:t>
+                            <m:t>1-</m:t>
+                          </m:r>
+                          <m:r>
+                            <w:rPr>
+                              <w:rFonts w:eastAsiaTheme="minorEastAsia"/>
+                            </w:rPr>
+                            <m:t>i</m:t>
                           </m:r>
                         </m:e>
                       </m:d>
@@ -10768,7 +11746,13 @@
                             <w:rPr>
                               <w:rFonts w:eastAsiaTheme="minorEastAsia"/>
                             </w:rPr>
-                            <m:t>1+i</m:t>
+                            <m:t>1+</m:t>
+                          </m:r>
+                          <m:r>
+                            <w:rPr>
+                              <w:rFonts w:eastAsiaTheme="minorEastAsia"/>
+                            </w:rPr>
+                            <m:t>i</m:t>
                           </m:r>
                         </m:e>
                       </m:d>
@@ -10806,7 +11790,13 @@
                 <w:rPr>
                   <w:rFonts w:eastAsiaTheme="minorEastAsia"/>
                 </w:rPr>
-                <m:t>+b</m:t>
+                <m:t>+</m:t>
+              </m:r>
+              <m:r>
+                <w:rPr>
+                  <w:rFonts w:eastAsiaTheme="minorEastAsia"/>
+                </w:rPr>
+                <m:t>b</m:t>
               </m:r>
               <m:d>
                 <m:dPr>
@@ -10842,7 +11832,13 @@
                             <w:rPr>
                               <w:rFonts w:eastAsiaTheme="minorEastAsia"/>
                             </w:rPr>
-                            <m:t>1-i</m:t>
+                            <m:t>1-</m:t>
+                          </m:r>
+                          <m:r>
+                            <w:rPr>
+                              <w:rFonts w:eastAsiaTheme="minorEastAsia"/>
+                            </w:rPr>
+                            <m:t>i</m:t>
                           </m:r>
                         </m:e>
                       </m:d>
@@ -10866,7 +11862,13 @@
                             <w:rPr>
                               <w:rFonts w:eastAsiaTheme="minorEastAsia"/>
                             </w:rPr>
-                            <m:t>1+i</m:t>
+                            <m:t>1+</m:t>
+                          </m:r>
+                          <m:r>
+                            <w:rPr>
+                              <w:rFonts w:eastAsiaTheme="minorEastAsia"/>
+                            </w:rPr>
+                            <m:t>i</m:t>
                           </m:r>
                         </m:e>
                       </m:d>
@@ -10922,7 +11924,13 @@
                             <w:rPr>
                               <w:rFonts w:eastAsiaTheme="minorEastAsia"/>
                             </w:rPr>
-                            <m:t>1-i</m:t>
+                            <m:t>1-</m:t>
+                          </m:r>
+                          <m:r>
+                            <w:rPr>
+                              <w:rFonts w:eastAsiaTheme="minorEastAsia"/>
+                            </w:rPr>
+                            <m:t>i</m:t>
                           </m:r>
                         </m:e>
                       </m:d>
@@ -10946,7 +11954,13 @@
                             <w:rPr>
                               <w:rFonts w:eastAsiaTheme="minorEastAsia"/>
                             </w:rPr>
-                            <m:t>1+i</m:t>
+                            <m:t>1+</m:t>
+                          </m:r>
+                          <m:r>
+                            <w:rPr>
+                              <w:rFonts w:eastAsiaTheme="minorEastAsia"/>
+                            </w:rPr>
+                            <m:t>i</m:t>
                           </m:r>
                         </m:e>
                       </m:d>
@@ -11002,7 +12016,13 @@
                             <w:rPr>
                               <w:rFonts w:eastAsiaTheme="minorEastAsia"/>
                             </w:rPr>
-                            <m:t>1+i</m:t>
+                            <m:t>1+</m:t>
+                          </m:r>
+                          <m:r>
+                            <w:rPr>
+                              <w:rFonts w:eastAsiaTheme="minorEastAsia"/>
+                            </w:rPr>
+                            <m:t>i</m:t>
                           </m:r>
                         </m:e>
                       </m:d>
@@ -11026,7 +12046,13 @@
                             <w:rPr>
                               <w:rFonts w:eastAsiaTheme="minorEastAsia"/>
                             </w:rPr>
-                            <m:t>1-i</m:t>
+                            <m:t>1-</m:t>
+                          </m:r>
+                          <m:r>
+                            <w:rPr>
+                              <w:rFonts w:eastAsiaTheme="minorEastAsia"/>
+                            </w:rPr>
+                            <m:t>i</m:t>
                           </m:r>
                         </m:e>
                       </m:d>
@@ -11082,7 +12108,13 @@
                             <w:rPr>
                               <w:rFonts w:eastAsiaTheme="minorEastAsia"/>
                             </w:rPr>
-                            <m:t>1+i</m:t>
+                            <m:t>1+</m:t>
+                          </m:r>
+                          <m:r>
+                            <w:rPr>
+                              <w:rFonts w:eastAsiaTheme="minorEastAsia"/>
+                            </w:rPr>
+                            <m:t>i</m:t>
                           </m:r>
                         </m:e>
                       </m:d>
@@ -11106,7 +12138,13 @@
                             <w:rPr>
                               <w:rFonts w:eastAsiaTheme="minorEastAsia"/>
                             </w:rPr>
-                            <m:t>1-i</m:t>
+                            <m:t>1-</m:t>
+                          </m:r>
+                          <m:r>
+                            <w:rPr>
+                              <w:rFonts w:eastAsiaTheme="minorEastAsia"/>
+                            </w:rPr>
+                            <m:t>i</m:t>
                           </m:r>
                         </m:e>
                       </m:d>
@@ -11194,7 +12232,13 @@
                     <w:rPr>
                       <w:rFonts w:eastAsiaTheme="minorEastAsia"/>
                     </w:rPr>
-                    <m:t>-πi</m:t>
+                    <m:t>-</m:t>
+                  </m:r>
+                  <m:r>
+                    <w:rPr>
+                      <w:rFonts w:eastAsiaTheme="minorEastAsia"/>
+                    </w:rPr>
+                    <m:t>πi</m:t>
                   </m:r>
                   <m:r>
                     <m:rPr>
@@ -11279,7 +12323,13 @@
                     <w:rPr>
                       <w:rFonts w:eastAsiaTheme="minorEastAsia"/>
                     </w:rPr>
-                    <m:t>+2i</m:t>
+                    <m:t>+2</m:t>
+                  </m:r>
+                  <m:r>
+                    <w:rPr>
+                      <w:rFonts w:eastAsiaTheme="minorEastAsia"/>
+                    </w:rPr>
+                    <m:t>i</m:t>
                   </m:r>
                   <m:d>
                     <m:dPr>
@@ -11331,7 +12381,25 @@
                     <w:rPr>
                       <w:rFonts w:eastAsiaTheme="minorEastAsia"/>
                     </w:rPr>
-                    <m:t xml:space="preserve">-2i </m:t>
+                    <m:t>-</m:t>
+                  </m:r>
+                  <m:r>
+                    <w:rPr>
+                      <w:rFonts w:eastAsiaTheme="minorEastAsia"/>
+                    </w:rPr>
+                    <m:t>2</m:t>
+                  </m:r>
+                  <m:r>
+                    <w:rPr>
+                      <w:rFonts w:eastAsiaTheme="minorEastAsia"/>
+                    </w:rPr>
+                    <m:t>i</m:t>
+                  </m:r>
+                  <m:r>
+                    <w:rPr>
+                      <w:rFonts w:eastAsiaTheme="minorEastAsia"/>
+                    </w:rPr>
+                    <m:t xml:space="preserve"> </m:t>
                   </m:r>
                   <m:d>
                     <m:dPr>
@@ -11359,7 +12427,13 @@
                 <w:rPr>
                   <w:rFonts w:eastAsiaTheme="minorEastAsia"/>
                 </w:rPr>
-                <m:t>+b</m:t>
+                <m:t>+</m:t>
+              </m:r>
+              <m:r>
+                <w:rPr>
+                  <w:rFonts w:eastAsiaTheme="minorEastAsia"/>
+                </w:rPr>
+                <m:t>b</m:t>
               </m:r>
               <m:d>
                 <m:dPr>
@@ -11401,7 +12475,19 @@
                     <w:rPr>
                       <w:rFonts w:eastAsiaTheme="minorEastAsia"/>
                     </w:rPr>
-                    <m:t>-2i</m:t>
+                    <m:t>-</m:t>
+                  </m:r>
+                  <m:r>
+                    <w:rPr>
+                      <w:rFonts w:eastAsiaTheme="minorEastAsia"/>
+                    </w:rPr>
+                    <m:t>2</m:t>
+                  </m:r>
+                  <m:r>
+                    <w:rPr>
+                      <w:rFonts w:eastAsiaTheme="minorEastAsia"/>
+                    </w:rPr>
+                    <m:t>i</m:t>
                   </m:r>
                   <m:d>
                     <m:dPr>
@@ -11453,7 +12539,13 @@
                     <w:rPr>
                       <w:rFonts w:eastAsiaTheme="minorEastAsia"/>
                     </w:rPr>
-                    <m:t>+2i</m:t>
+                    <m:t>+2</m:t>
+                  </m:r>
+                  <m:r>
+                    <w:rPr>
+                      <w:rFonts w:eastAsiaTheme="minorEastAsia"/>
+                    </w:rPr>
+                    <m:t>i</m:t>
                   </m:r>
                   <m:d>
                     <m:dPr>
@@ -11531,7 +12623,13 @@
                     <w:rPr>
                       <w:rFonts w:eastAsiaTheme="minorEastAsia"/>
                     </w:rPr>
-                    <m:t>-πi</m:t>
+                    <m:t>-</m:t>
+                  </m:r>
+                  <m:r>
+                    <w:rPr>
+                      <w:rFonts w:eastAsiaTheme="minorEastAsia"/>
+                    </w:rPr>
+                    <m:t>πi</m:t>
                   </m:r>
                   <m:r>
                     <m:rPr>
@@ -11610,7 +12708,13 @@
                     <w:rPr>
                       <w:rFonts w:eastAsiaTheme="minorEastAsia"/>
                     </w:rPr>
-                    <m:t>+i</m:t>
+                    <m:t>+</m:t>
+                  </m:r>
+                  <m:r>
+                    <w:rPr>
+                      <w:rFonts w:eastAsiaTheme="minorEastAsia"/>
+                    </w:rPr>
+                    <m:t>i</m:t>
                   </m:r>
                   <m:d>
                     <m:dPr>
@@ -11662,7 +12766,19 @@
                     <w:rPr>
                       <w:rFonts w:eastAsiaTheme="minorEastAsia"/>
                     </w:rPr>
-                    <m:t xml:space="preserve">-i </m:t>
+                    <m:t>-</m:t>
+                  </m:r>
+                  <m:r>
+                    <w:rPr>
+                      <w:rFonts w:eastAsiaTheme="minorEastAsia"/>
+                    </w:rPr>
+                    <m:t>i</m:t>
+                  </m:r>
+                  <m:r>
+                    <w:rPr>
+                      <w:rFonts w:eastAsiaTheme="minorEastAsia"/>
+                    </w:rPr>
+                    <m:t xml:space="preserve"> </m:t>
                   </m:r>
                   <m:d>
                     <m:dPr>
@@ -11690,7 +12806,13 @@
                 <w:rPr>
                   <w:rFonts w:eastAsiaTheme="minorEastAsia"/>
                 </w:rPr>
-                <m:t>+b</m:t>
+                <m:t>+</m:t>
+              </m:r>
+              <m:r>
+                <w:rPr>
+                  <w:rFonts w:eastAsiaTheme="minorEastAsia"/>
+                </w:rPr>
+                <m:t>b</m:t>
               </m:r>
               <m:d>
                 <m:dPr>
@@ -11726,7 +12848,13 @@
                     <w:rPr>
                       <w:rFonts w:eastAsiaTheme="minorEastAsia"/>
                     </w:rPr>
-                    <m:t>-i</m:t>
+                    <m:t>-</m:t>
+                  </m:r>
+                  <m:r>
+                    <w:rPr>
+                      <w:rFonts w:eastAsiaTheme="minorEastAsia"/>
+                    </w:rPr>
+                    <m:t>i</m:t>
                   </m:r>
                   <m:d>
                     <m:dPr>
@@ -11778,7 +12906,13 @@
                     <w:rPr>
                       <w:rFonts w:eastAsiaTheme="minorEastAsia"/>
                     </w:rPr>
-                    <m:t>+i</m:t>
+                    <m:t>+</m:t>
+                  </m:r>
+                  <m:r>
+                    <w:rPr>
+                      <w:rFonts w:eastAsiaTheme="minorEastAsia"/>
+                    </w:rPr>
+                    <m:t>i</m:t>
                   </m:r>
                   <m:d>
                     <m:dPr>
@@ -12412,7 +13546,10 @@
             <m:rPr>
               <m:aln/>
             </m:rPr>
-            <m:t>=a</m:t>
+            <m:t>=</m:t>
+          </m:r>
+          <m:r>
+            <m:t>a</m:t>
           </m:r>
           <m:d>
             <m:dPr>
@@ -12469,7 +13606,10 @@
             </m:e>
           </m:d>
           <m:r>
-            <m:t>+b</m:t>
+            <m:t>+</m:t>
+          </m:r>
+          <m:r>
+            <m:t>b</m:t>
           </m:r>
           <m:d>
             <m:dPr>
@@ -12562,7 +13702,10 @@
             </m:e>
           </m:d>
           <m:r>
-            <m:t>+b</m:t>
+            <m:t>+</m:t>
+          </m:r>
+          <m:r>
+            <m:t>b</m:t>
           </m:r>
           <m:d>
             <m:dPr>
@@ -12667,7 +13810,10 @@
                 </m:e>
               </m:d>
               <m:r>
-                <m:t>+b</m:t>
+                <m:t>+</m:t>
+              </m:r>
+              <m:r>
+                <m:t>b</m:t>
               </m:r>
               <m:d>
                 <m:dPr>
@@ -12835,7 +13981,10 @@
                 </m:e>
               </m:d>
               <m:r>
-                <m:t>+b</m:t>
+                <m:t>+</m:t>
+              </m:r>
+              <m:r>
+                <m:t>b</m:t>
               </m:r>
               <m:d>
                 <m:dPr>
@@ -12951,7 +14100,10 @@
                 </m:e>
               </m:d>
               <m:r>
-                <m:t>+b</m:t>
+                <m:t>+</m:t>
+              </m:r>
+              <m:r>
+                <m:t>b</m:t>
               </m:r>
               <m:d>
                 <m:dPr>
@@ -13013,7 +14165,13 @@
           <w:rPr>
             <w:rFonts w:eastAsiaTheme="minorEastAsia"/>
           </w:rPr>
-          <m:t>t=7</m:t>
+          <m:t>t</m:t>
+        </m:r>
+        <m:r>
+          <w:rPr>
+            <w:rFonts w:eastAsiaTheme="minorEastAsia"/>
+          </w:rPr>
+          <m:t>=7</m:t>
         </m:r>
       </m:oMath>
       <w:r>
@@ -13158,7 +14316,10 @@
                 </m:e>
               </m:d>
               <m:r>
-                <m:t>+b</m:t>
+                <m:t>+</m:t>
+              </m:r>
+              <m:r>
+                <m:t>b</m:t>
               </m:r>
               <m:d>
                 <m:dPr>
@@ -13320,7 +14481,10 @@
                 </m:e>
               </m:d>
               <m:r>
-                <m:t>+b</m:t>
+                <m:t>+</m:t>
+              </m:r>
+              <m:r>
+                <m:t>b</m:t>
               </m:r>
               <m:d>
                 <m:dPr>
@@ -13506,7 +14670,10 @@
                     </m:e>
                   </m:d>
                   <m:r>
-                    <m:t>+b</m:t>
+                    <m:t>+</m:t>
+                  </m:r>
+                  <m:r>
+                    <m:t>b</m:t>
                   </m:r>
                   <m:d>
                     <m:dPr>
@@ -13582,7 +14749,10 @@
                     </m:e>
                   </m:d>
                   <m:r>
-                    <m:t>+b</m:t>
+                    <m:t>+</m:t>
+                  </m:r>
+                  <m:r>
+                    <m:t>b</m:t>
                   </m:r>
                   <m:d>
                     <m:dPr>
@@ -13818,7 +14988,10 @@
                     </m:e>
                   </m:d>
                   <m:r>
-                    <m:t>+b</m:t>
+                    <m:t>+</m:t>
+                  </m:r>
+                  <m:r>
+                    <m:t>b</m:t>
                   </m:r>
                   <m:d>
                     <m:dPr>
@@ -13938,7 +15111,10 @@
                     </m:e>
                   </m:d>
                   <m:r>
-                    <m:t>+b</m:t>
+                    <m:t>+</m:t>
+                  </m:r>
+                  <m:r>
+                    <m:t>b</m:t>
                   </m:r>
                   <m:d>
                     <m:dPr>
@@ -14105,7 +15281,10 @@
                     </m:e>
                   </m:d>
                   <m:r>
-                    <m:t>+b</m:t>
+                    <m:t>+</m:t>
+                  </m:r>
+                  <m:r>
+                    <m:t>b</m:t>
                   </m:r>
                   <m:d>
                     <m:dPr>
@@ -14181,7 +15360,10 @@
                     </m:e>
                   </m:d>
                   <m:r>
-                    <m:t>+b</m:t>
+                    <m:t>+</m:t>
+                  </m:r>
+                  <m:r>
+                    <m:t>b</m:t>
                   </m:r>
                   <m:d>
                     <m:dPr>
@@ -14309,7 +15491,13 @@
                 <w:rPr>
                   <w:rFonts w:eastAsiaTheme="minorEastAsia"/>
                 </w:rPr>
-                <m:t>+a</m:t>
+                <m:t>+</m:t>
+              </m:r>
+              <m:r>
+                <w:rPr>
+                  <w:rFonts w:eastAsiaTheme="minorEastAsia"/>
+                </w:rPr>
+                <m:t>a</m:t>
               </m:r>
               <m:d>
                 <m:dPr>
@@ -14335,7 +15523,13 @@
                 <w:rPr>
                   <w:rFonts w:eastAsiaTheme="minorEastAsia"/>
                 </w:rPr>
-                <m:t>+b</m:t>
+                <m:t>+</m:t>
+              </m:r>
+              <m:r>
+                <w:rPr>
+                  <w:rFonts w:eastAsiaTheme="minorEastAsia"/>
+                </w:rPr>
+                <m:t>b</m:t>
               </m:r>
               <m:d>
                 <m:dPr>
@@ -14361,7 +15555,13 @@
                 <w:rPr>
                   <w:rFonts w:eastAsiaTheme="minorEastAsia"/>
                 </w:rPr>
-                <m:t>+b</m:t>
+                <m:t>+</m:t>
+              </m:r>
+              <m:r>
+                <w:rPr>
+                  <w:rFonts w:eastAsiaTheme="minorEastAsia"/>
+                </w:rPr>
+                <m:t>b</m:t>
               </m:r>
               <m:d>
                 <m:dPr>
@@ -14387,7 +15587,13 @@
                 <w:rPr>
                   <w:rFonts w:eastAsiaTheme="minorEastAsia"/>
                 </w:rPr>
-                <m:t>+a</m:t>
+                <m:t>+</m:t>
+              </m:r>
+              <m:r>
+                <w:rPr>
+                  <w:rFonts w:eastAsiaTheme="minorEastAsia"/>
+                </w:rPr>
+                <m:t>a</m:t>
               </m:r>
               <m:d>
                 <m:dPr>
@@ -14413,7 +15619,13 @@
                 <w:rPr>
                   <w:rFonts w:eastAsiaTheme="minorEastAsia"/>
                 </w:rPr>
-                <m:t>-a</m:t>
+                <m:t>-</m:t>
+              </m:r>
+              <m:r>
+                <w:rPr>
+                  <w:rFonts w:eastAsiaTheme="minorEastAsia"/>
+                </w:rPr>
+                <m:t>a</m:t>
               </m:r>
               <m:d>
                 <m:dPr>
@@ -14439,7 +15651,13 @@
                 <w:rPr>
                   <w:rFonts w:eastAsiaTheme="minorEastAsia"/>
                 </w:rPr>
-                <m:t>+b</m:t>
+                <m:t>+</m:t>
+              </m:r>
+              <m:r>
+                <w:rPr>
+                  <w:rFonts w:eastAsiaTheme="minorEastAsia"/>
+                </w:rPr>
+                <m:t>b</m:t>
               </m:r>
               <m:d>
                 <m:dPr>
@@ -14465,7 +15683,13 @@
                 <w:rPr>
                   <w:rFonts w:eastAsiaTheme="minorEastAsia"/>
                 </w:rPr>
-                <m:t>-b</m:t>
+                <m:t>-</m:t>
+              </m:r>
+              <m:r>
+                <w:rPr>
+                  <w:rFonts w:eastAsiaTheme="minorEastAsia"/>
+                </w:rPr>
+                <m:t>b</m:t>
               </m:r>
               <m:d>
                 <m:dPr>
@@ -15191,7 +16415,13 @@
                     <w:rPr>
                       <w:rFonts w:eastAsiaTheme="minorEastAsia"/>
                     </w:rPr>
-                    <m:t>-πi</m:t>
+                    <m:t>-</m:t>
+                  </m:r>
+                  <m:r>
+                    <w:rPr>
+                      <w:rFonts w:eastAsiaTheme="minorEastAsia"/>
+                    </w:rPr>
+                    <m:t>πi</m:t>
                   </m:r>
                   <m:r>
                     <m:rPr>
@@ -15270,7 +16500,13 @@
                     <w:rPr>
                       <w:rFonts w:eastAsiaTheme="minorEastAsia"/>
                     </w:rPr>
-                    <m:t>+i</m:t>
+                    <m:t>+</m:t>
+                  </m:r>
+                  <m:r>
+                    <w:rPr>
+                      <w:rFonts w:eastAsiaTheme="minorEastAsia"/>
+                    </w:rPr>
+                    <m:t>i</m:t>
                   </m:r>
                   <m:d>
                     <m:dPr>
@@ -15322,7 +16558,19 @@
                     <w:rPr>
                       <w:rFonts w:eastAsiaTheme="minorEastAsia"/>
                     </w:rPr>
-                    <m:t xml:space="preserve">-i </m:t>
+                    <m:t>-</m:t>
+                  </m:r>
+                  <m:r>
+                    <w:rPr>
+                      <w:rFonts w:eastAsiaTheme="minorEastAsia"/>
+                    </w:rPr>
+                    <m:t>i</m:t>
+                  </m:r>
+                  <m:r>
+                    <w:rPr>
+                      <w:rFonts w:eastAsiaTheme="minorEastAsia"/>
+                    </w:rPr>
+                    <m:t xml:space="preserve"> </m:t>
                   </m:r>
                   <m:d>
                     <m:dPr>
@@ -15350,7 +16598,13 @@
                 <w:rPr>
                   <w:rFonts w:eastAsiaTheme="minorEastAsia"/>
                 </w:rPr>
-                <m:t>+b</m:t>
+                <m:t>+</m:t>
+              </m:r>
+              <m:r>
+                <w:rPr>
+                  <w:rFonts w:eastAsiaTheme="minorEastAsia"/>
+                </w:rPr>
+                <m:t>b</m:t>
               </m:r>
               <m:d>
                 <m:dPr>
@@ -15386,7 +16640,13 @@
                     <w:rPr>
                       <w:rFonts w:eastAsiaTheme="minorEastAsia"/>
                     </w:rPr>
-                    <m:t>-i</m:t>
+                    <m:t>-</m:t>
+                  </m:r>
+                  <m:r>
+                    <w:rPr>
+                      <w:rFonts w:eastAsiaTheme="minorEastAsia"/>
+                    </w:rPr>
+                    <m:t>i</m:t>
                   </m:r>
                   <m:d>
                     <m:dPr>
@@ -15438,7 +16698,13 @@
                     <w:rPr>
                       <w:rFonts w:eastAsiaTheme="minorEastAsia"/>
                     </w:rPr>
-                    <m:t>+i</m:t>
+                    <m:t>+</m:t>
+                  </m:r>
+                  <m:r>
+                    <w:rPr>
+                      <w:rFonts w:eastAsiaTheme="minorEastAsia"/>
+                    </w:rPr>
+                    <m:t>i</m:t>
                   </m:r>
                   <m:d>
                     <m:dPr>
@@ -15516,7 +16782,13 @@
                     <w:rPr>
                       <w:rFonts w:eastAsiaTheme="minorEastAsia"/>
                     </w:rPr>
-                    <m:t>-πi</m:t>
+                    <m:t>-</m:t>
+                  </m:r>
+                  <m:r>
+                    <w:rPr>
+                      <w:rFonts w:eastAsiaTheme="minorEastAsia"/>
+                    </w:rPr>
+                    <m:t>πi</m:t>
                   </m:r>
                   <m:r>
                     <m:rPr>
@@ -15569,7 +16841,19 @@
                     <w:rPr>
                       <w:rFonts w:eastAsiaTheme="minorEastAsia"/>
                     </w:rPr>
-                    <m:t>a+b</m:t>
+                    <m:t>a</m:t>
+                  </m:r>
+                  <m:r>
+                    <w:rPr>
+                      <w:rFonts w:eastAsiaTheme="minorEastAsia"/>
+                    </w:rPr>
+                    <m:t>+</m:t>
+                  </m:r>
+                  <m:r>
+                    <w:rPr>
+                      <w:rFonts w:eastAsiaTheme="minorEastAsia"/>
+                    </w:rPr>
+                    <m:t>b</m:t>
                   </m:r>
                 </m:e>
               </m:d>
@@ -15597,23 +16881,41 @@
                 <w:rPr>
                   <w:rFonts w:eastAsiaTheme="minorEastAsia"/>
                 </w:rPr>
-                <m:t>+i</m:t>
-              </m:r>
-              <m:d>
-                <m:dPr>
-                  <m:ctrlPr>
-                    <w:rPr>
-                      <w:rFonts w:eastAsiaTheme="minorEastAsia"/>
-                      <w:i/>
-                    </w:rPr>
-                  </m:ctrlPr>
-                </m:dPr>
-                <m:e>
-                  <m:r>
-                    <w:rPr>
-                      <w:rFonts w:eastAsiaTheme="minorEastAsia"/>
-                    </w:rPr>
-                    <m:t>a-b</m:t>
+                <m:t>+</m:t>
+              </m:r>
+              <m:r>
+                <w:rPr>
+                  <w:rFonts w:eastAsiaTheme="minorEastAsia"/>
+                </w:rPr>
+                <m:t>i</m:t>
+              </m:r>
+              <m:d>
+                <m:dPr>
+                  <m:ctrlPr>
+                    <w:rPr>
+                      <w:rFonts w:eastAsiaTheme="minorEastAsia"/>
+                      <w:i/>
+                    </w:rPr>
+                  </m:ctrlPr>
+                </m:dPr>
+                <m:e>
+                  <m:r>
+                    <w:rPr>
+                      <w:rFonts w:eastAsiaTheme="minorEastAsia"/>
+                    </w:rPr>
+                    <m:t>a</m:t>
+                  </m:r>
+                  <m:r>
+                    <w:rPr>
+                      <w:rFonts w:eastAsiaTheme="minorEastAsia"/>
+                    </w:rPr>
+                    <m:t>-</m:t>
+                  </m:r>
+                  <m:r>
+                    <w:rPr>
+                      <w:rFonts w:eastAsiaTheme="minorEastAsia"/>
+                    </w:rPr>
+                    <m:t>b</m:t>
                   </m:r>
                 </m:e>
               </m:d>
@@ -15657,7 +16959,19 @@
                     <w:rPr>
                       <w:rFonts w:eastAsiaTheme="minorEastAsia"/>
                     </w:rPr>
-                    <m:t>a+b</m:t>
+                    <m:t>a</m:t>
+                  </m:r>
+                  <m:r>
+                    <w:rPr>
+                      <w:rFonts w:eastAsiaTheme="minorEastAsia"/>
+                    </w:rPr>
+                    <m:t>+</m:t>
+                  </m:r>
+                  <m:r>
+                    <w:rPr>
+                      <w:rFonts w:eastAsiaTheme="minorEastAsia"/>
+                    </w:rPr>
+                    <m:t>b</m:t>
                   </m:r>
                 </m:e>
               </m:d>
@@ -15685,23 +16999,47 @@
                 <w:rPr>
                   <w:rFonts w:eastAsiaTheme="minorEastAsia"/>
                 </w:rPr>
-                <m:t>+i</m:t>
-              </m:r>
-              <m:d>
-                <m:dPr>
-                  <m:ctrlPr>
-                    <w:rPr>
-                      <w:rFonts w:eastAsiaTheme="minorEastAsia"/>
-                      <w:i/>
-                    </w:rPr>
-                  </m:ctrlPr>
-                </m:dPr>
-                <m:e>
-                  <m:r>
-                    <w:rPr>
-                      <w:rFonts w:eastAsiaTheme="minorEastAsia"/>
-                    </w:rPr>
-                    <m:t>-a+b</m:t>
+                <m:t>+</m:t>
+              </m:r>
+              <m:r>
+                <w:rPr>
+                  <w:rFonts w:eastAsiaTheme="minorEastAsia"/>
+                </w:rPr>
+                <m:t>i</m:t>
+              </m:r>
+              <m:d>
+                <m:dPr>
+                  <m:ctrlPr>
+                    <w:rPr>
+                      <w:rFonts w:eastAsiaTheme="minorEastAsia"/>
+                      <w:i/>
+                    </w:rPr>
+                  </m:ctrlPr>
+                </m:dPr>
+                <m:e>
+                  <m:r>
+                    <w:rPr>
+                      <w:rFonts w:eastAsiaTheme="minorEastAsia"/>
+                    </w:rPr>
+                    <m:t>-</m:t>
+                  </m:r>
+                  <m:r>
+                    <w:rPr>
+                      <w:rFonts w:eastAsiaTheme="minorEastAsia"/>
+                    </w:rPr>
+                    <m:t>a</m:t>
+                  </m:r>
+                  <m:r>
+                    <w:rPr>
+                      <w:rFonts w:eastAsiaTheme="minorEastAsia"/>
+                    </w:rPr>
+                    <m:t>+</m:t>
+                  </m:r>
+                  <m:r>
+                    <w:rPr>
+                      <w:rFonts w:eastAsiaTheme="minorEastAsia"/>
+                    </w:rPr>
+                    <m:t>b</m:t>
                   </m:r>
                 </m:e>
               </m:d>
@@ -15889,7 +17227,19 @@
                         <w:rPr>
                           <w:rFonts w:eastAsiaTheme="minorEastAsia"/>
                         </w:rPr>
-                        <m:t>a+b</m:t>
+                        <m:t>a</m:t>
+                      </m:r>
+                      <m:r>
+                        <w:rPr>
+                          <w:rFonts w:eastAsiaTheme="minorEastAsia"/>
+                        </w:rPr>
+                        <m:t>+</m:t>
+                      </m:r>
+                      <m:r>
+                        <w:rPr>
+                          <w:rFonts w:eastAsiaTheme="minorEastAsia"/>
+                        </w:rPr>
+                        <m:t>b</m:t>
                       </m:r>
                     </m:num>
                     <m:den>
@@ -15955,7 +17305,19 @@
                         <w:rPr>
                           <w:rFonts w:eastAsiaTheme="minorEastAsia"/>
                         </w:rPr>
-                        <m:t>a+b</m:t>
+                        <m:t>a</m:t>
+                      </m:r>
+                      <m:r>
+                        <w:rPr>
+                          <w:rFonts w:eastAsiaTheme="minorEastAsia"/>
+                        </w:rPr>
+                        <m:t>+</m:t>
+                      </m:r>
+                      <m:r>
+                        <w:rPr>
+                          <w:rFonts w:eastAsiaTheme="minorEastAsia"/>
+                        </w:rPr>
+                        <m:t>b</m:t>
                       </m:r>
                     </m:num>
                     <m:den>
@@ -16021,7 +17383,19 @@
                         <w:rPr>
                           <w:rFonts w:eastAsiaTheme="minorEastAsia"/>
                         </w:rPr>
-                        <m:t>a+b</m:t>
+                        <m:t>a</m:t>
+                      </m:r>
+                      <m:r>
+                        <w:rPr>
+                          <w:rFonts w:eastAsiaTheme="minorEastAsia"/>
+                        </w:rPr>
+                        <m:t>+</m:t>
+                      </m:r>
+                      <m:r>
+                        <w:rPr>
+                          <w:rFonts w:eastAsiaTheme="minorEastAsia"/>
+                        </w:rPr>
+                        <m:t>b</m:t>
                       </m:r>
                     </m:num>
                     <m:den>
@@ -16302,7 +17676,13 @@
                 <w:rPr>
                   <w:rFonts w:eastAsiaTheme="minorEastAsia"/>
                 </w:rPr>
-                <m:t>+a</m:t>
+                <m:t>+</m:t>
+              </m:r>
+              <m:r>
+                <w:rPr>
+                  <w:rFonts w:eastAsiaTheme="minorEastAsia"/>
+                </w:rPr>
+                <m:t>a</m:t>
               </m:r>
               <m:d>
                 <m:dPr>
@@ -16328,7 +17708,13 @@
                 <w:rPr>
                   <w:rFonts w:eastAsiaTheme="minorEastAsia"/>
                 </w:rPr>
-                <m:t>+b</m:t>
+                <m:t>+</m:t>
+              </m:r>
+              <m:r>
+                <w:rPr>
+                  <w:rFonts w:eastAsiaTheme="minorEastAsia"/>
+                </w:rPr>
+                <m:t>b</m:t>
               </m:r>
               <m:d>
                 <m:dPr>
@@ -16354,7 +17740,13 @@
                 <w:rPr>
                   <w:rFonts w:eastAsiaTheme="minorEastAsia"/>
                 </w:rPr>
-                <m:t>+b</m:t>
+                <m:t>+</m:t>
+              </m:r>
+              <m:r>
+                <w:rPr>
+                  <w:rFonts w:eastAsiaTheme="minorEastAsia"/>
+                </w:rPr>
+                <m:t>b</m:t>
               </m:r>
               <m:d>
                 <m:dPr>
@@ -16380,7 +17772,13 @@
                 <w:rPr>
                   <w:rFonts w:eastAsiaTheme="minorEastAsia"/>
                 </w:rPr>
-                <m:t>+a</m:t>
+                <m:t>+</m:t>
+              </m:r>
+              <m:r>
+                <w:rPr>
+                  <w:rFonts w:eastAsiaTheme="minorEastAsia"/>
+                </w:rPr>
+                <m:t>a</m:t>
               </m:r>
               <m:d>
                 <m:dPr>
@@ -16406,7 +17804,13 @@
                 <w:rPr>
                   <w:rFonts w:eastAsiaTheme="minorEastAsia"/>
                 </w:rPr>
-                <m:t>-a</m:t>
+                <m:t>-</m:t>
+              </m:r>
+              <m:r>
+                <w:rPr>
+                  <w:rFonts w:eastAsiaTheme="minorEastAsia"/>
+                </w:rPr>
+                <m:t>a</m:t>
               </m:r>
               <m:d>
                 <m:dPr>
@@ -16432,7 +17836,13 @@
                 <w:rPr>
                   <w:rFonts w:eastAsiaTheme="minorEastAsia"/>
                 </w:rPr>
-                <m:t>+b</m:t>
+                <m:t>+</m:t>
+              </m:r>
+              <m:r>
+                <w:rPr>
+                  <w:rFonts w:eastAsiaTheme="minorEastAsia"/>
+                </w:rPr>
+                <m:t>b</m:t>
               </m:r>
               <m:d>
                 <m:dPr>
@@ -16458,7 +17868,13 @@
                 <w:rPr>
                   <w:rFonts w:eastAsiaTheme="minorEastAsia"/>
                 </w:rPr>
-                <m:t>-b</m:t>
+                <m:t>-</m:t>
+              </m:r>
+              <m:r>
+                <w:rPr>
+                  <w:rFonts w:eastAsiaTheme="minorEastAsia"/>
+                </w:rPr>
+                <m:t>b</m:t>
               </m:r>
               <m:d>
                 <m:dPr>
@@ -16552,7 +17968,19 @@
                     <w:rPr>
                       <w:rFonts w:eastAsiaTheme="minorEastAsia"/>
                     </w:rPr>
-                    <m:t>a+b</m:t>
+                    <m:t>a</m:t>
+                  </m:r>
+                  <m:r>
+                    <w:rPr>
+                      <w:rFonts w:eastAsiaTheme="minorEastAsia"/>
+                    </w:rPr>
+                    <m:t>+</m:t>
+                  </m:r>
+                  <m:r>
+                    <w:rPr>
+                      <w:rFonts w:eastAsiaTheme="minorEastAsia"/>
+                    </w:rPr>
+                    <m:t>b</m:t>
                   </m:r>
                 </m:e>
               </m:d>
@@ -16596,7 +18024,19 @@
                     <w:rPr>
                       <w:rFonts w:eastAsiaTheme="minorEastAsia"/>
                     </w:rPr>
-                    <m:t>a-b</m:t>
+                    <m:t>a</m:t>
+                  </m:r>
+                  <m:r>
+                    <w:rPr>
+                      <w:rFonts w:eastAsiaTheme="minorEastAsia"/>
+                    </w:rPr>
+                    <m:t>-</m:t>
+                  </m:r>
+                  <m:r>
+                    <w:rPr>
+                      <w:rFonts w:eastAsiaTheme="minorEastAsia"/>
+                    </w:rPr>
+                    <m:t>b</m:t>
                   </m:r>
                 </m:e>
               </m:d>
@@ -16640,7 +18080,19 @@
                     <w:rPr>
                       <w:rFonts w:eastAsiaTheme="minorEastAsia"/>
                     </w:rPr>
-                    <m:t>a+b</m:t>
+                    <m:t>a</m:t>
+                  </m:r>
+                  <m:r>
+                    <w:rPr>
+                      <w:rFonts w:eastAsiaTheme="minorEastAsia"/>
+                    </w:rPr>
+                    <m:t>+</m:t>
+                  </m:r>
+                  <m:r>
+                    <w:rPr>
+                      <w:rFonts w:eastAsiaTheme="minorEastAsia"/>
+                    </w:rPr>
+                    <m:t>b</m:t>
                   </m:r>
                 </m:e>
               </m:d>
@@ -16684,7 +18136,25 @@
                     <w:rPr>
                       <w:rFonts w:eastAsiaTheme="minorEastAsia"/>
                     </w:rPr>
-                    <m:t>-a+b</m:t>
+                    <m:t>-</m:t>
+                  </m:r>
+                  <m:r>
+                    <w:rPr>
+                      <w:rFonts w:eastAsiaTheme="minorEastAsia"/>
+                    </w:rPr>
+                    <m:t>a</m:t>
+                  </m:r>
+                  <m:r>
+                    <w:rPr>
+                      <w:rFonts w:eastAsiaTheme="minorEastAsia"/>
+                    </w:rPr>
+                    <m:t>+</m:t>
+                  </m:r>
+                  <m:r>
+                    <w:rPr>
+                      <w:rFonts w:eastAsiaTheme="minorEastAsia"/>
+                    </w:rPr>
+                    <m:t>b</m:t>
                   </m:r>
                 </m:e>
               </m:d>
@@ -16888,7 +18358,19 @@
                         <w:rPr>
                           <w:rFonts w:eastAsiaTheme="minorEastAsia"/>
                         </w:rPr>
-                        <m:t>a+b</m:t>
+                        <m:t>a</m:t>
+                      </m:r>
+                      <m:r>
+                        <w:rPr>
+                          <w:rFonts w:eastAsiaTheme="minorEastAsia"/>
+                        </w:rPr>
+                        <m:t>+</m:t>
+                      </m:r>
+                      <m:r>
+                        <w:rPr>
+                          <w:rFonts w:eastAsiaTheme="minorEastAsia"/>
+                        </w:rPr>
+                        <m:t>b</m:t>
                       </m:r>
                     </m:num>
                     <m:den>
@@ -16954,7 +18436,19 @@
                         <w:rPr>
                           <w:rFonts w:eastAsiaTheme="minorEastAsia"/>
                         </w:rPr>
-                        <m:t>a+b</m:t>
+                        <m:t>a</m:t>
+                      </m:r>
+                      <m:r>
+                        <w:rPr>
+                          <w:rFonts w:eastAsiaTheme="minorEastAsia"/>
+                        </w:rPr>
+                        <m:t>+</m:t>
+                      </m:r>
+                      <m:r>
+                        <w:rPr>
+                          <w:rFonts w:eastAsiaTheme="minorEastAsia"/>
+                        </w:rPr>
+                        <m:t>b</m:t>
                       </m:r>
                     </m:num>
                     <m:den>
@@ -17020,7 +18514,19 @@
                         <w:rPr>
                           <w:rFonts w:eastAsiaTheme="minorEastAsia"/>
                         </w:rPr>
-                        <m:t>a+b</m:t>
+                        <m:t>a</m:t>
+                      </m:r>
+                      <m:r>
+                        <w:rPr>
+                          <w:rFonts w:eastAsiaTheme="minorEastAsia"/>
+                        </w:rPr>
+                        <m:t>+</m:t>
+                      </m:r>
+                      <m:r>
+                        <w:rPr>
+                          <w:rFonts w:eastAsiaTheme="minorEastAsia"/>
+                        </w:rPr>
+                        <m:t>b</m:t>
                       </m:r>
                     </m:num>
                     <m:den>

</xml_diff>